<commit_message>
Cap nhat Project 14
</commit_message>
<xml_diff>
--- a/MosWord2019.WinForms/Projects/Word2019_P13/starter.docx
+++ b/MosWord2019.WinForms/Projects/Word2019_P13/starter.docx
@@ -42,7 +42,7 @@
       </w:pPr>
       <w:r>
         <w:pict w14:anchorId="60581B23">
-          <v:rect id="_x0000_s2181" style="position:absolute;left:0;text-align:left;margin-left:414.95pt;margin-top:-14.1pt;width:196.7pt;height:600.65pt;z-index:-16043520;mso-position-horizontal-relative:page" fillcolor="#f1f1f1" stroked="f">
+          <v:rect id="_x0000_s1157" style="position:absolute;left:0;text-align:left;margin-left:414.95pt;margin-top:-14.1pt;width:196.7pt;height:600.65pt;z-index:-16043520;mso-position-horizontal-relative:page" fillcolor="#f1f1f1" stroked="f">
             <w10:wrap anchorx="page"/>
           </v:rect>
         </w:pict>
@@ -62,7 +62,6 @@
         </w:rPr>
         <w:tab/>
       </w:r>
-      <w:proofErr w:type="spellStart"/>
       <w:r>
         <w:rPr>
           <w:smallCaps/>
@@ -71,7 +70,6 @@
         </w:rPr>
         <w:t>woodgrove</w:t>
       </w:r>
-      <w:proofErr w:type="spellEnd"/>
       <w:r>
         <w:rPr>
           <w:smallCaps/>
@@ -536,7 +534,7 @@
       </w:pPr>
       <w:r>
         <w:pict w14:anchorId="2F15F8B7">
-          <v:shape id="_x0000_s2180" style="position:absolute;margin-left:54.6pt;margin-top:15.55pt;width:355pt;height:4.3pt;z-index:-15728640;mso-wrap-distance-left:0;mso-wrap-distance-right:0;mso-position-horizontal-relative:page" coordorigin="1092,311" coordsize="7100,86" path="m8192,311r-3545,l1092,311r,86l4647,397r3545,l8192,311xe" fillcolor="#0e6ec5" stroked="f">
+          <v:shape id="_x0000_s1156" style="position:absolute;margin-left:54.6pt;margin-top:15.55pt;width:355pt;height:4.3pt;z-index:-15728640;mso-wrap-distance-left:0;mso-wrap-distance-right:0;mso-position-horizontal-relative:page" coordorigin="1092,311" coordsize="7100,86" path="m8192,311r-3545,l1092,311r,86l4647,397r3545,l8192,311xe" fillcolor="#0e6ec5" stroked="f">
             <v:path arrowok="t"/>
             <w10:wrap type="topAndBottom" anchorx="page"/>
           </v:shape>
@@ -754,7 +752,7 @@
       <w:r>
         <w:lastRenderedPageBreak/>
         <w:pict w14:anchorId="78F346A4">
-          <v:rect id="_x0000_s2179" style="position:absolute;margin-left:414.95pt;margin-top:95.45pt;width:196.7pt;height:600.65pt;z-index:-16036352;mso-position-horizontal-relative:page;mso-position-vertical-relative:page" fillcolor="#f1f1f1" stroked="f">
+          <v:rect id="_x0000_s1155" style="position:absolute;margin-left:414.95pt;margin-top:95.45pt;width:196.7pt;height:600.65pt;z-index:-16036352;mso-position-horizontal-relative:page;mso-position-vertical-relative:page" fillcolor="#f1f1f1" stroked="f">
             <w10:wrap anchorx="page" anchory="page"/>
           </v:rect>
         </w:pict>
@@ -795,7 +793,7 @@
           <w:sz w:val="20"/>
         </w:rPr>
         <w:pict w14:anchorId="53CF6FF5">
-          <v:group id="_x0000_s2173" style="width:399.95pt;height:61.95pt;mso-position-horizontal-relative:char;mso-position-vertical-relative:line" coordsize="7999,1239">
+          <v:group id="_x0000_s1149" style="width:399.95pt;height:61.95pt;mso-position-horizontal-relative:char;mso-position-vertical-relative:line" coordsize="7999,1239">
             <v:shapetype id="_x0000_t75" coordsize="21600,21600" o:spt="75" o:preferrelative="t" path="m@4@5l@4@11@9@11@9@5xe" filled="f" stroked="f">
               <v:stroke joinstyle="miter"/>
               <v:formulas>
@@ -815,11 +813,11 @@
               <v:path o:extrusionok="f" gradientshapeok="t" o:connecttype="rect"/>
               <o:lock v:ext="edit" aspectratio="t"/>
             </v:shapetype>
-            <v:shape id="_x0000_s2178" type="#_x0000_t75" style="position:absolute;left:6231;top:7;width:1760;height:1224">
+            <v:shape id="_x0000_s1154" type="#_x0000_t75" style="position:absolute;left:6231;top:7;width:1760;height:1224">
               <v:imagedata r:id="rId7" o:title=""/>
             </v:shape>
-            <v:rect id="_x0000_s2177" style="position:absolute;left:6231;top:7;width:1760;height:1224" filled="f" strokecolor="white" strokeweight=".26772mm"/>
-            <v:shape id="_x0000_s2176" style="position:absolute;top:823;width:7234;height:326" coordorigin=",824" coordsize="7234,326" o:spt="100" adj="0,,0" path="m7188,1104r-7142,l,1104r,46l46,1150r7142,l7188,1104xm7188,869l46,869,,869r,235l46,1104r7142,l7188,869xm7188,824l46,824,,824r,45l46,869r7142,l7188,824xm7234,1104r-46,l7188,1150r46,l7234,1104xm7234,869r-46,l7188,1104r46,l7234,869xm7234,824r-46,l7188,869r46,l7234,824xe" fillcolor="#0e6ec5" stroked="f">
+            <v:rect id="_x0000_s1153" style="position:absolute;left:6231;top:7;width:1760;height:1224" filled="f" strokecolor="white" strokeweight=".26772mm"/>
+            <v:shape id="_x0000_s1152" style="position:absolute;top:823;width:7234;height:326" coordorigin=",824" coordsize="7234,326" o:spt="100" adj="0,,0" path="m7188,1104r-7142,l,1104r,46l46,1150r7142,l7188,1104xm7188,869l46,869,,869r,235l46,1104r7142,l7188,869xm7188,824l46,824,,824r,45l46,869r7142,l7188,824xm7234,1104r-46,l7188,1150r46,l7234,1104xm7234,869r-46,l7188,1104r46,l7234,869xm7234,824r-46,l7188,869r46,l7234,824xe" fillcolor="#0e6ec5" stroked="f">
               <v:stroke joinstyle="round"/>
               <v:formulas/>
               <v:path arrowok="t" o:connecttype="segments"/>
@@ -828,24 +826,18 @@
               <v:stroke joinstyle="miter"/>
               <v:path gradientshapeok="t" o:connecttype="rect"/>
             </v:shapetype>
-            <v:shape id="_x0000_s2175" type="#_x0000_t202" style="position:absolute;left:22;top:823;width:7252;height:326" filled="f" stroked="f">
-              <v:textbox style="mso-next-textbox:#_x0000_s2175" inset="0,0,0,0">
+            <v:shape id="_x0000_s1151" type="#_x0000_t202" style="position:absolute;left:22;top:823;width:7252;height:326" filled="f" stroked="f">
+              <v:textbox style="mso-next-textbox:#_x0000_s1151" inset="0,0,0,0">
                 <w:txbxContent>
                   <w:p>
                     <w:pPr>
-                      <w:spacing w:before="51"/>
-                      <w:ind w:left="44"/>
-                      <w:rPr>
-                        <w:sz w:val="16"/>
-                      </w:rPr>
+                      <w:pStyle w:val="Heading2"/>
                     </w:pPr>
                     <w:bookmarkStart w:id="0" w:name="_Hlk89732826"/>
                     <w:bookmarkStart w:id="1" w:name="_Hlk89732827"/>
                     <w:r>
                       <w:rPr>
-                        <w:color w:val="FFFFFF"/>
                         <w:w w:val="105"/>
-                        <w:sz w:val="16"/>
                       </w:rPr>
                       <w:t>Kadry</w:t>
                     </w:r>
@@ -855,8 +847,8 @@
                 </w:txbxContent>
               </v:textbox>
             </v:shape>
-            <v:shape id="_x0000_s2174" type="#_x0000_t202" style="position:absolute;left:7581;top:168;width:113;height:183" filled="f" stroked="f">
-              <v:textbox style="mso-next-textbox:#_x0000_s2174" inset="0,0,0,0">
+            <v:shape id="_x0000_s1150" type="#_x0000_t202" style="position:absolute;left:7581;top:168;width:113;height:183" filled="f" stroked="f">
+              <v:textbox style="mso-next-textbox:#_x0000_s1150" inset="0,0,0,0">
                 <w:txbxContent>
                   <w:p>
                     <w:pPr>
@@ -901,14 +893,12 @@
         </w:rPr>
         <w:t xml:space="preserve"> </w:t>
       </w:r>
-      <w:proofErr w:type="spellStart"/>
       <w:r>
         <w:rPr>
           <w:w w:val="105"/>
         </w:rPr>
         <w:t>Woodgrove</w:t>
       </w:r>
-      <w:proofErr w:type="spellEnd"/>
       <w:r>
         <w:rPr>
           <w:spacing w:val="-4"/>
@@ -1098,12 +1088,12 @@
       </w:r>
       <w:r>
         <w:pict w14:anchorId="260888E4">
-          <v:group id="_x0000_s2170" style="position:absolute;margin-left:115pt;margin-top:10.4pt;width:218.05pt;height:21.75pt;z-index:-15726592;mso-wrap-distance-left:0;mso-wrap-distance-right:0;mso-position-horizontal-relative:page;mso-position-vertical-relative:text" coordorigin="2300,208" coordsize="4361,435">
-            <v:shape id="_x0000_s2172" style="position:absolute;left:2299;top:207;width:4361;height:435" coordorigin="2300,208" coordsize="4361,435" path="m6660,208r-4143,l2300,425r217,218l6660,643r,-435xe" fillcolor="#0e6ec5" stroked="f">
+          <v:group id="_x0000_s1146" style="position:absolute;margin-left:115pt;margin-top:10.4pt;width:218.05pt;height:21.75pt;z-index:-15726592;mso-wrap-distance-left:0;mso-wrap-distance-right:0;mso-position-horizontal-relative:page;mso-position-vertical-relative:text" coordorigin="2300,208" coordsize="4361,435">
+            <v:shape id="_x0000_s1148" style="position:absolute;left:2299;top:207;width:4361;height:435" coordorigin="2300,208" coordsize="4361,435" path="m6660,208r-4143,l2300,425r217,218l6660,643r,-435xe" fillcolor="#0e6ec5" stroked="f">
               <v:path arrowok="t"/>
             </v:shape>
-            <v:shape id="_x0000_s2171" type="#_x0000_t202" style="position:absolute;left:2299;top:207;width:4361;height:435" filled="f" stroked="f">
-              <v:textbox style="mso-next-textbox:#_x0000_s2171" inset="0,0,0,0">
+            <v:shape id="_x0000_s1147" type="#_x0000_t202" style="position:absolute;left:2299;top:207;width:4361;height:435" filled="f" stroked="f">
+              <v:textbox style="mso-next-textbox:#_x0000_s1147" inset="0,0,0,0">
                 <w:txbxContent>
                   <w:p>
                     <w:pPr>
@@ -1146,15 +1136,15 @@
       </w:r>
       <w:r>
         <w:pict w14:anchorId="30785C2F">
-          <v:group id="_x0000_s2166" style="position:absolute;margin-left:93.5pt;margin-top:38.6pt;width:239.5pt;height:21.75pt;z-index:-15726080;mso-wrap-distance-left:0;mso-wrap-distance-right:0;mso-position-horizontal-relative:page;mso-position-vertical-relative:text" coordorigin="1870,772" coordsize="4790,435">
-            <v:shape id="_x0000_s2169" style="position:absolute;left:2299;top:772;width:4361;height:435" coordorigin="2300,772" coordsize="4361,435" path="m6660,772r-4143,l2300,990r217,217l6660,1207r,-435xe" fillcolor="#0e6ec5" stroked="f">
+          <v:group id="_x0000_s1142" style="position:absolute;margin-left:93.5pt;margin-top:38.6pt;width:239.5pt;height:21.75pt;z-index:-15726080;mso-wrap-distance-left:0;mso-wrap-distance-right:0;mso-position-horizontal-relative:page;mso-position-vertical-relative:text" coordorigin="1870,772" coordsize="4790,435">
+            <v:shape id="_x0000_s1145" style="position:absolute;left:2299;top:772;width:4361;height:435" coordorigin="2300,772" coordsize="4361,435" path="m6660,772r-4143,l2300,990r217,217l6660,1207r,-435xe" fillcolor="#0e6ec5" stroked="f">
               <v:path arrowok="t"/>
             </v:shape>
-            <v:shape id="_x0000_s2168" type="#_x0000_t75" style="position:absolute;left:1870;top:862;width:382;height:254">
+            <v:shape id="_x0000_s1144" type="#_x0000_t75" style="position:absolute;left:1870;top:862;width:382;height:254">
               <v:imagedata r:id="rId9" o:title=""/>
             </v:shape>
-            <v:shape id="_x0000_s2167" type="#_x0000_t202" style="position:absolute;left:1870;top:772;width:4790;height:435" filled="f" stroked="f">
-              <v:textbox style="mso-next-textbox:#_x0000_s2167" inset="0,0,0,0">
+            <v:shape id="_x0000_s1143" type="#_x0000_t202" style="position:absolute;left:1870;top:772;width:4790;height:435" filled="f" stroked="f">
+              <v:textbox style="mso-next-textbox:#_x0000_s1143" inset="0,0,0,0">
                 <w:txbxContent>
                   <w:p>
                     <w:pPr>
@@ -1196,15 +1186,15 @@
       </w:r>
       <w:r>
         <w:pict w14:anchorId="14754A3F">
-          <v:group id="_x0000_s2162" style="position:absolute;margin-left:93.05pt;margin-top:66.85pt;width:239.95pt;height:21.75pt;z-index:-15725568;mso-wrap-distance-left:0;mso-wrap-distance-right:0;mso-position-horizontal-relative:page;mso-position-vertical-relative:text" coordorigin="1861,1337" coordsize="4799,435">
-            <v:shape id="_x0000_s2165" style="position:absolute;left:2299;top:1337;width:4361;height:435" coordorigin="2300,1337" coordsize="4361,435" path="m6660,1337r-4143,l2300,1555r217,217l6660,1772r,-435xe" fillcolor="#0e6ec5" stroked="f">
+          <v:group id="_x0000_s1138" style="position:absolute;margin-left:93.05pt;margin-top:66.85pt;width:239.95pt;height:21.75pt;z-index:-15725568;mso-wrap-distance-left:0;mso-wrap-distance-right:0;mso-position-horizontal-relative:page;mso-position-vertical-relative:text" coordorigin="1861,1337" coordsize="4799,435">
+            <v:shape id="_x0000_s1141" style="position:absolute;left:2299;top:1337;width:4361;height:435" coordorigin="2300,1337" coordsize="4361,435" path="m6660,1337r-4143,l2300,1555r217,217l6660,1772r,-435xe" fillcolor="#0e6ec5" stroked="f">
               <v:path arrowok="t"/>
             </v:shape>
-            <v:shape id="_x0000_s2164" type="#_x0000_t75" style="position:absolute;left:1861;top:1463;width:400;height:182">
+            <v:shape id="_x0000_s1140" type="#_x0000_t75" style="position:absolute;left:1861;top:1463;width:400;height:182">
               <v:imagedata r:id="rId10" o:title=""/>
             </v:shape>
-            <v:shape id="_x0000_s2163" type="#_x0000_t202" style="position:absolute;left:1861;top:1337;width:4799;height:435" filled="f" stroked="f">
-              <v:textbox style="mso-next-textbox:#_x0000_s2163" inset="0,0,0,0">
+            <v:shape id="_x0000_s1139" type="#_x0000_t202" style="position:absolute;left:1861;top:1337;width:4799;height:435" filled="f" stroked="f">
+              <v:textbox style="mso-next-textbox:#_x0000_s1139" inset="0,0,0,0">
                 <w:txbxContent>
                   <w:p>
                     <w:pPr>
@@ -1294,12 +1284,12 @@
       </w:r>
       <w:r>
         <w:pict w14:anchorId="6704BE1F">
-          <v:group id="_x0000_s2159" style="position:absolute;margin-left:115pt;margin-top:95.1pt;width:218.05pt;height:21.75pt;z-index:-15724544;mso-wrap-distance-left:0;mso-wrap-distance-right:0;mso-position-horizontal-relative:page;mso-position-vertical-relative:text" coordorigin="2300,1902" coordsize="4361,435">
-            <v:shape id="_x0000_s2161" style="position:absolute;left:2299;top:1901;width:4361;height:435" coordorigin="2300,1902" coordsize="4361,435" path="m6660,1902r-4143,l2300,2119r217,218l6660,2337r,-435xe" fillcolor="#0e6ec5" stroked="f">
+          <v:group id="_x0000_s1135" style="position:absolute;margin-left:115pt;margin-top:95.1pt;width:218.05pt;height:21.75pt;z-index:-15724544;mso-wrap-distance-left:0;mso-wrap-distance-right:0;mso-position-horizontal-relative:page;mso-position-vertical-relative:text" coordorigin="2300,1902" coordsize="4361,435">
+            <v:shape id="_x0000_s1137" style="position:absolute;left:2299;top:1901;width:4361;height:435" coordorigin="2300,1902" coordsize="4361,435" path="m6660,1902r-4143,l2300,2119r217,218l6660,2337r,-435xe" fillcolor="#0e6ec5" stroked="f">
               <v:path arrowok="t"/>
             </v:shape>
-            <v:shape id="_x0000_s2160" type="#_x0000_t202" style="position:absolute;left:2299;top:1901;width:4361;height:435" filled="f" stroked="f">
-              <v:textbox style="mso-next-textbox:#_x0000_s2160" inset="0,0,0,0">
+            <v:shape id="_x0000_s1136" type="#_x0000_t202" style="position:absolute;left:2299;top:1901;width:4361;height:435" filled="f" stroked="f">
+              <v:textbox style="mso-next-textbox:#_x0000_s1136" inset="0,0,0,0">
                 <w:txbxContent>
                   <w:p>
                     <w:pPr>
@@ -1341,15 +1331,15 @@
       </w:r>
       <w:r>
         <w:pict w14:anchorId="3BFEA3E6">
-          <v:group id="_x0000_s2155" style="position:absolute;margin-left:94pt;margin-top:123.35pt;width:239.05pt;height:21.75pt;z-index:-15724032;mso-wrap-distance-left:0;mso-wrap-distance-right:0;mso-position-horizontal-relative:page;mso-position-vertical-relative:text" coordorigin="1880,2467" coordsize="4781,435">
-            <v:shape id="_x0000_s2158" style="position:absolute;left:2299;top:2466;width:4361;height:435" coordorigin="2300,2467" coordsize="4361,435" path="m6660,2467r-4143,l2300,2684r217,217l6660,2901r,-434xe" fillcolor="#0e6ec5" stroked="f">
+          <v:group id="_x0000_s1131" style="position:absolute;margin-left:94pt;margin-top:123.35pt;width:239.05pt;height:21.75pt;z-index:-15724032;mso-wrap-distance-left:0;mso-wrap-distance-right:0;mso-position-horizontal-relative:page;mso-position-vertical-relative:text" coordorigin="1880,2467" coordsize="4781,435">
+            <v:shape id="_x0000_s1134" style="position:absolute;left:2299;top:2466;width:4361;height:435" coordorigin="2300,2467" coordsize="4361,435" path="m6660,2467r-4143,l2300,2684r217,217l6660,2901r,-434xe" fillcolor="#0e6ec5" stroked="f">
               <v:path arrowok="t"/>
             </v:shape>
-            <v:shape id="_x0000_s2157" type="#_x0000_t75" style="position:absolute;left:1879;top:2557;width:363;height:254">
+            <v:shape id="_x0000_s1133" type="#_x0000_t75" style="position:absolute;left:1879;top:2557;width:363;height:254">
               <v:imagedata r:id="rId12" o:title=""/>
             </v:shape>
-            <v:shape id="_x0000_s2156" type="#_x0000_t202" style="position:absolute;left:1879;top:2466;width:4781;height:435" filled="f" stroked="f">
-              <v:textbox style="mso-next-textbox:#_x0000_s2156" inset="0,0,0,0">
+            <v:shape id="_x0000_s1132" type="#_x0000_t202" style="position:absolute;left:1879;top:2466;width:4781;height:435" filled="f" stroked="f">
+              <v:textbox style="mso-next-textbox:#_x0000_s1132" inset="0,0,0,0">
                 <w:txbxContent>
                   <w:p>
                     <w:pPr>
@@ -1439,12 +1429,12 @@
       </w:r>
       <w:r>
         <w:pict w14:anchorId="1214E873">
-          <v:group id="_x0000_s2152" style="position:absolute;margin-left:115pt;margin-top:151.55pt;width:218.05pt;height:21.75pt;z-index:-15723008;mso-wrap-distance-left:0;mso-wrap-distance-right:0;mso-position-horizontal-relative:page;mso-position-vertical-relative:text" coordorigin="2300,3031" coordsize="4361,435">
-            <v:shape id="_x0000_s2154" style="position:absolute;left:2299;top:3031;width:4361;height:435" coordorigin="2300,3031" coordsize="4361,435" path="m6660,3031r-4143,l2300,3249r217,217l6660,3466r,-435xe" fillcolor="#0e6ec5" stroked="f">
+          <v:group id="_x0000_s1128" style="position:absolute;margin-left:115pt;margin-top:151.55pt;width:218.05pt;height:21.75pt;z-index:-15723008;mso-wrap-distance-left:0;mso-wrap-distance-right:0;mso-position-horizontal-relative:page;mso-position-vertical-relative:text" coordorigin="2300,3031" coordsize="4361,435">
+            <v:shape id="_x0000_s1130" style="position:absolute;left:2299;top:3031;width:4361;height:435" coordorigin="2300,3031" coordsize="4361,435" path="m6660,3031r-4143,l2300,3249r217,217l6660,3466r,-435xe" fillcolor="#0e6ec5" stroked="f">
               <v:path arrowok="t"/>
             </v:shape>
-            <v:shape id="_x0000_s2153" type="#_x0000_t202" style="position:absolute;left:2299;top:3031;width:4361;height:435" filled="f" stroked="f">
-              <v:textbox style="mso-next-textbox:#_x0000_s2153" inset="0,0,0,0">
+            <v:shape id="_x0000_s1129" type="#_x0000_t202" style="position:absolute;left:2299;top:3031;width:4361;height:435" filled="f" stroked="f">
+              <v:textbox style="mso-next-textbox:#_x0000_s1129" inset="0,0,0,0">
                 <w:txbxContent>
                   <w:p>
                     <w:pPr>
@@ -1501,15 +1491,15 @@
       </w:r>
       <w:r>
         <w:pict w14:anchorId="47263395">
-          <v:group id="_x0000_s2148" style="position:absolute;margin-left:94.1pt;margin-top:179.8pt;width:238.95pt;height:21.75pt;z-index:-15722496;mso-wrap-distance-left:0;mso-wrap-distance-right:0;mso-position-horizontal-relative:page;mso-position-vertical-relative:text" coordorigin="1882,3596" coordsize="4779,435">
-            <v:shape id="_x0000_s2151" style="position:absolute;left:2299;top:3596;width:4361;height:435" coordorigin="2300,3596" coordsize="4361,435" path="m6660,3596r-4143,l2300,3814r217,217l6660,4031r,-435xe" fillcolor="#0e6ec5" stroked="f">
+          <v:group id="_x0000_s1124" style="position:absolute;margin-left:94.1pt;margin-top:179.8pt;width:238.95pt;height:21.75pt;z-index:-15722496;mso-wrap-distance-left:0;mso-wrap-distance-right:0;mso-position-horizontal-relative:page;mso-position-vertical-relative:text" coordorigin="1882,3596" coordsize="4779,435">
+            <v:shape id="_x0000_s1127" style="position:absolute;left:2299;top:3596;width:4361;height:435" coordorigin="2300,3596" coordsize="4361,435" path="m6660,3596r-4143,l2300,3814r217,217l6660,4031r,-435xe" fillcolor="#0e6ec5" stroked="f">
               <v:path arrowok="t"/>
             </v:shape>
-            <v:shape id="_x0000_s2150" type="#_x0000_t75" style="position:absolute;left:1881;top:3638;width:359;height:348">
+            <v:shape id="_x0000_s1126" type="#_x0000_t75" style="position:absolute;left:1881;top:3638;width:359;height:348">
               <v:imagedata r:id="rId14" o:title=""/>
             </v:shape>
-            <v:shape id="_x0000_s2149" type="#_x0000_t202" style="position:absolute;left:1881;top:3596;width:4779;height:435" filled="f" stroked="f">
-              <v:textbox style="mso-next-textbox:#_x0000_s2149" inset="0,0,0,0">
+            <v:shape id="_x0000_s1125" type="#_x0000_t202" style="position:absolute;left:1881;top:3596;width:4779;height:435" filled="f" stroked="f">
+              <v:textbox style="mso-next-textbox:#_x0000_s1125" inset="0,0,0,0">
                 <w:txbxContent>
                   <w:p>
                     <w:pPr>
@@ -1837,7 +1827,7 @@
       </w:pPr>
       <w:r>
         <w:pict w14:anchorId="4CA5A744">
-          <v:shape id="_x0000_s2146" style="position:absolute;margin-left:54.6pt;margin-top:9.55pt;width:355pt;height:4.3pt;z-index:-15721472;mso-wrap-distance-left:0;mso-wrap-distance-right:0;mso-position-horizontal-relative:page" coordorigin="1092,191" coordsize="7100,86" path="m8192,191r-3545,l1092,191r,86l4647,277r3545,l8192,191xe" fillcolor="#0e6ec5" stroked="f">
+          <v:shape id="_x0000_s1122" style="position:absolute;margin-left:54.6pt;margin-top:9.55pt;width:355pt;height:4.3pt;z-index:-15721472;mso-wrap-distance-left:0;mso-wrap-distance-right:0;mso-position-horizontal-relative:page" coordorigin="1092,191" coordsize="7100,86" path="m8192,191r-3545,l1092,191r,86l4647,277r3545,l8192,191xe" fillcolor="#0e6ec5" stroked="f">
             <v:path arrowok="t"/>
             <w10:wrap type="topAndBottom" anchorx="page"/>
           </v:shape>
@@ -1988,8 +1978,8 @@
           <w:sz w:val="20"/>
         </w:rPr>
         <w:pict w14:anchorId="729958AE">
-          <v:shape id="_x0000_s2186" type="#_x0000_t202" style="width:223.2pt;height:31.75pt;visibility:visible;mso-left-percent:-10001;mso-top-percent:-10001;mso-position-horizontal:absolute;mso-position-horizontal-relative:char;mso-position-vertical:absolute;mso-position-vertical-relative:line;mso-left-percent:-10001;mso-top-percent:-10001" filled="f" stroked="f">
-            <v:textbox style="mso-next-textbox:#_x0000_s2186" inset="0,0,0,0">
+          <v:shape id="_x0000_s1162" type="#_x0000_t202" style="width:223.2pt;height:31.75pt;visibility:visible;mso-left-percent:-10001;mso-top-percent:-10001;mso-position-horizontal:absolute;mso-position-horizontal-relative:char;mso-position-vertical:absolute;mso-position-vertical-relative:line;mso-left-percent:-10001;mso-top-percent:-10001" filled="f" stroked="f">
+            <v:textbox style="mso-next-textbox:#_x0000_s1162" inset="0,0,0,0">
               <w:txbxContent>
                 <w:p>
                   <w:pPr>
@@ -2239,14 +2229,12 @@
           <w:sz w:val="20"/>
         </w:rPr>
         <w:pict w14:anchorId="1D3F761A">
-          <v:shape id="_x0000_s2185" type="#_x0000_t202" style="width:362.6pt;height:16.3pt;visibility:visible;mso-left-percent:-10001;mso-top-percent:-10001;mso-position-horizontal:absolute;mso-position-horizontal-relative:char;mso-position-vertical:absolute;mso-position-vertical-relative:line;mso-left-percent:-10001;mso-top-percent:-10001" fillcolor="#c6e1f9" stroked="f">
-            <v:textbox style="mso-next-textbox:#_x0000_s2185" inset="0,0,0,0">
+          <v:shape id="_x0000_s1161" type="#_x0000_t202" style="width:362.6pt;height:16.3pt;visibility:visible;mso-left-percent:-10001;mso-top-percent:-10001;mso-position-horizontal:absolute;mso-position-horizontal-relative:char;mso-position-vertical:absolute;mso-position-vertical-relative:line;mso-left-percent:-10001;mso-top-percent:-10001" fillcolor="#c6e1f9" stroked="f">
+            <v:textbox style="mso-next-textbox:#_x0000_s1161" inset="0,0,0,0">
               <w:txbxContent>
                 <w:p>
                   <w:pPr>
-                    <w:pStyle w:val="BodyText"/>
-                    <w:spacing w:before="51"/>
-                    <w:ind w:left="44"/>
+                    <w:pStyle w:val="Heading3"/>
                   </w:pPr>
                   <w:r>
                     <w:rPr>
@@ -2308,7 +2296,7 @@
       </w:pPr>
       <w:r>
         <w:pict w14:anchorId="26A28B74">
-          <v:line id="_x0000_s2143" style="position:absolute;left:0;text-align:left;z-index:-16031744;visibility:visible;mso-position-horizontal-relative:page" from="180.95pt,-57.95pt" to="283.25pt,-57.95pt" strokecolor="#0e6ec5" strokeweight=".19472mm">
+          <v:line id="_x0000_s1119" style="position:absolute;left:0;text-align:left;z-index:-16031744;visibility:visible;mso-position-horizontal-relative:page" from="180.95pt,-57.95pt" to="283.25pt,-57.95pt" strokecolor="#0e6ec5" strokeweight=".19472mm">
             <v:stroke dashstyle="1 1"/>
             <w10:wrap anchorx="page"/>
           </v:line>
@@ -2316,7 +2304,7 @@
       </w:r>
       <w:r>
         <w:pict w14:anchorId="44CCA9F9">
-          <v:shape id="_x0000_s2142" style="position:absolute;left:0;text-align:left;margin-left:51.25pt;margin-top:-17.25pt;width:2.3pt;height:16.3pt;z-index:15741952;visibility:visible;mso-position-horizontal-relative:page" coordorigin="1025,-345" coordsize="46,326" path="m1070,-345r-45,l1025,-300r,235l1025,-19r45,l1070,-65r,-234l1070,-345xe" fillcolor="#c6e1f9" stroked="f">
+          <v:shape id="_x0000_s1118" style="position:absolute;left:0;text-align:left;margin-left:51.25pt;margin-top:-17.25pt;width:2.3pt;height:16.3pt;z-index:15741952;visibility:visible;mso-position-horizontal-relative:page" coordorigin="1025,-345" coordsize="46,326" path="m1070,-345r-45,l1025,-300r,235l1025,-19r45,l1070,-65r,-234l1070,-345xe" fillcolor="#c6e1f9" stroked="f">
             <v:path arrowok="t"/>
             <w10:wrap anchorx="page"/>
           </v:shape>
@@ -2324,7 +2312,7 @@
       </w:r>
       <w:r>
         <w:pict w14:anchorId="7AA17E36">
-          <v:shape id="_x0000_s2141" style="position:absolute;left:0;text-align:left;margin-left:410.65pt;margin-top:-17.25pt;width:2.3pt;height:16.3pt;z-index:-16030208;visibility:visible;mso-position-horizontal-relative:page" coordorigin="8213,-345" coordsize="46,326" path="m8259,-345r-46,l8213,-300r,235l8213,-19r46,l8259,-65r,-234l8259,-345xe" fillcolor="#c6e1f9" stroked="f">
+          <v:shape id="_x0000_s1117" style="position:absolute;left:0;text-align:left;margin-left:410.65pt;margin-top:-17.25pt;width:2.3pt;height:16.3pt;z-index:-16030208;visibility:visible;mso-position-horizontal-relative:page" coordorigin="8213,-345" coordsize="46,326" path="m8259,-345r-46,l8213,-300r,235l8213,-19r46,l8259,-65r,-234l8259,-345xe" fillcolor="#c6e1f9" stroked="f">
             <v:path arrowok="t"/>
             <w10:wrap anchorx="page"/>
           </v:shape>
@@ -2332,22 +2320,22 @@
       </w:r>
       <w:r>
         <w:pict w14:anchorId="2073C5C5">
-          <v:group id="_x0000_s2135" style="position:absolute;left:0;text-align:left;margin-left:67.15pt;margin-top:-132.75pt;width:75.2pt;height:57.35pt;z-index:15746048;mso-position-horizontal-relative:page" coordorigin="1343,-2655" coordsize="1504,1147">
-            <v:shape id="_x0000_s2140" style="position:absolute;left:1343;top:-2192;width:1504;height:683" coordorigin="1343,-2191" coordsize="1504,683" o:spt="100" adj="0,,0" path="m2847,-2191r-1504,l1343,-1509r1504,l2847,-1611r-1333,l1446,-1679r,-341l1514,-2089r1333,l2847,-2191xm2847,-2089r-154,l2745,-2038r,376l2693,-1611r154,l2847,-2089xe" fillcolor="#4489d6" stroked="f">
+          <v:group id="_x0000_s1111" style="position:absolute;left:0;text-align:left;margin-left:67.15pt;margin-top:-132.75pt;width:75.2pt;height:57.35pt;z-index:15746048;mso-position-horizontal-relative:page" coordorigin="1343,-2655" coordsize="1504,1147">
+            <v:shape id="_x0000_s1116" style="position:absolute;left:1343;top:-2192;width:1504;height:683" coordorigin="1343,-2191" coordsize="1504,683" o:spt="100" adj="0,,0" path="m2847,-2191r-1504,l1343,-1509r1504,l2847,-1611r-1333,l1446,-1679r,-341l1514,-2089r1333,l2847,-2191xm2847,-2089r-154,l2745,-2038r,376l2693,-1611r154,l2847,-2089xe" fillcolor="#4489d6" stroked="f">
               <v:stroke joinstyle="round"/>
               <v:formulas/>
               <v:path arrowok="t" o:connecttype="segments"/>
             </v:shape>
-            <v:shape id="_x0000_s2139" type="#_x0000_t75" style="position:absolute;left:1958;top:-2021;width:274;height:342">
+            <v:shape id="_x0000_s1115" type="#_x0000_t75" style="position:absolute;left:1958;top:-2021;width:274;height:342">
               <v:imagedata r:id="rId16" o:title=""/>
             </v:shape>
-            <v:shape id="_x0000_s2138" type="#_x0000_t75" style="position:absolute;left:1616;top:-1902;width:103;height:103">
+            <v:shape id="_x0000_s1114" type="#_x0000_t75" style="position:absolute;left:1616;top:-1902;width:103;height:103">
               <v:imagedata r:id="rId17" o:title=""/>
             </v:shape>
-            <v:shape id="_x0000_s2137" type="#_x0000_t75" style="position:absolute;left:2471;top:-1902;width:103;height:103">
+            <v:shape id="_x0000_s1113" type="#_x0000_t75" style="position:absolute;left:2471;top:-1902;width:103;height:103">
               <v:imagedata r:id="rId18" o:title=""/>
             </v:shape>
-            <v:shape id="_x0000_s2136" style="position:absolute;left:1538;top:-2655;width:1161;height:396" coordorigin="1538,-2655" coordsize="1161,396" o:spt="100" adj="0,,0" path="m2529,-2476r-71,-179l1538,-2280r526,-104l2401,-2520r26,65l2529,-2476xm2698,-2259r-34,-174l1788,-2259r524,l2582,-2312r12,53l2698,-2259xe" fillcolor="#4489d6" stroked="f">
+            <v:shape id="_x0000_s1112" style="position:absolute;left:1538;top:-2655;width:1161;height:396" coordorigin="1538,-2655" coordsize="1161,396" o:spt="100" adj="0,,0" path="m2529,-2476r-71,-179l1538,-2280r526,-104l2401,-2520r26,65l2529,-2476xm2698,-2259r-34,-174l1788,-2259r524,l2582,-2312r12,53l2698,-2259xe" fillcolor="#4489d6" stroked="f">
               <v:stroke joinstyle="round"/>
               <v:formulas/>
               <v:path arrowok="t" o:connecttype="segments"/>
@@ -2358,8 +2346,8 @@
       </w:r>
       <w:r>
         <w:pict w14:anchorId="1476DCA1">
-          <v:shape id="_x0000_s2134" type="#_x0000_t202" style="position:absolute;left:0;text-align:left;margin-left:309.45pt;margin-top:-128.55pt;width:95.2pt;height:54.9pt;z-index:15747584;visibility:visible;mso-position-horizontal-relative:page" filled="f" stroked="f">
-            <v:textbox style="mso-next-textbox:#_x0000_s2134" inset="0,0,0,0">
+          <v:shape id="_x0000_s1110" type="#_x0000_t202" style="position:absolute;left:0;text-align:left;margin-left:309.45pt;margin-top:-128.55pt;width:95.2pt;height:54.9pt;z-index:15747584;visibility:visible;mso-position-horizontal-relative:page" filled="f" stroked="f">
+            <v:textbox style="mso-next-textbox:#_x0000_s1110" inset="0,0,0,0">
               <w:txbxContent>
                 <w:p>
                   <w:pPr>
@@ -2502,14 +2490,12 @@
                     </w:rPr>
                     <w:t xml:space="preserve"> </w:t>
                   </w:r>
-                  <w:proofErr w:type="spellStart"/>
                   <w:r>
                     <w:rPr>
                       <w:w w:val="105"/>
                     </w:rPr>
                     <w:t>Woodgrove</w:t>
                   </w:r>
-                  <w:proofErr w:type="spellEnd"/>
                   <w:r>
                     <w:rPr>
                       <w:spacing w:val="-7"/>
@@ -2605,8 +2591,8 @@
       </w:r>
       <w:r>
         <w:pict w14:anchorId="2EFAB999">
-          <v:shape id="_x0000_s2133" type="#_x0000_t202" style="position:absolute;left:0;text-align:left;margin-left:182.05pt;margin-top:-142pt;width:97.8pt;height:74.45pt;z-index:15748096;visibility:visible;mso-position-horizontal-relative:page" filled="f" stroked="f">
-            <v:textbox style="mso-next-textbox:#_x0000_s2133" inset="0,0,0,0">
+          <v:shape id="_x0000_s1109" type="#_x0000_t202" style="position:absolute;left:0;text-align:left;margin-left:182.05pt;margin-top:-142pt;width:97.8pt;height:74.45pt;z-index:15748096;visibility:visible;mso-position-horizontal-relative:page" filled="f" stroked="f">
+            <v:textbox style="mso-next-textbox:#_x0000_s1109" inset="0,0,0,0">
               <w:txbxContent>
                 <w:p>
                   <w:pPr>
@@ -2652,14 +2638,12 @@
                     </w:rPr>
                     <w:t xml:space="preserve"> </w:t>
                   </w:r>
-                  <w:proofErr w:type="gramStart"/>
                   <w:r>
                     <w:rPr>
                       <w:w w:val="105"/>
                     </w:rPr>
                     <w:t>students</w:t>
                   </w:r>
-                  <w:proofErr w:type="gramEnd"/>
                   <w:r>
                     <w:rPr>
                       <w:spacing w:val="-5"/>
@@ -2849,14 +2833,12 @@
         </w:rPr>
         <w:t xml:space="preserve"> </w:t>
       </w:r>
-      <w:proofErr w:type="gramStart"/>
       <w:r>
         <w:rPr>
           <w:w w:val="105"/>
         </w:rPr>
         <w:t>age</w:t>
       </w:r>
-      <w:proofErr w:type="gramEnd"/>
       <w:r>
         <w:rPr>
           <w:spacing w:val="-4"/>
@@ -2879,22 +2861,22 @@
       </w:pPr>
       <w:r>
         <w:pict w14:anchorId="63AEE365">
-          <v:group id="_x0000_s2127" style="position:absolute;left:0;text-align:left;margin-left:67.15pt;margin-top:.95pt;width:75.2pt;height:57.35pt;z-index:15746560;mso-position-horizontal-relative:page" coordorigin="1343,19" coordsize="1504,1147">
-            <v:shape id="_x0000_s2132" style="position:absolute;left:1343;top:482;width:1504;height:683" coordorigin="1343,482" coordsize="1504,683" o:spt="100" adj="0,,0" path="m2847,482r-1504,l1343,1165r1504,l2847,1062r-1333,l1446,994r,-341l1514,585r1333,l2847,482xm2847,585r-154,l2745,636r,375l2693,1062r154,l2847,585xe" fillcolor="#4489d6" stroked="f">
+          <v:group id="_x0000_s1103" style="position:absolute;left:0;text-align:left;margin-left:67.15pt;margin-top:.95pt;width:75.2pt;height:57.35pt;z-index:15746560;mso-position-horizontal-relative:page" coordorigin="1343,19" coordsize="1504,1147">
+            <v:shape id="_x0000_s1108" style="position:absolute;left:1343;top:482;width:1504;height:683" coordorigin="1343,482" coordsize="1504,683" o:spt="100" adj="0,,0" path="m2847,482r-1504,l1343,1165r1504,l2847,1062r-1333,l1446,994r,-341l1514,585r1333,l2847,482xm2847,585r-154,l2745,636r,375l2693,1062r154,l2847,585xe" fillcolor="#4489d6" stroked="f">
               <v:stroke joinstyle="round"/>
               <v:formulas/>
               <v:path arrowok="t" o:connecttype="segments"/>
             </v:shape>
-            <v:shape id="_x0000_s2131" type="#_x0000_t75" style="position:absolute;left:1958;top:653;width:274;height:342">
+            <v:shape id="_x0000_s1107" type="#_x0000_t75" style="position:absolute;left:1958;top:653;width:274;height:342">
               <v:imagedata r:id="rId16" o:title=""/>
             </v:shape>
-            <v:shape id="_x0000_s2130" type="#_x0000_t75" style="position:absolute;left:2471;top:772;width:103;height:103">
+            <v:shape id="_x0000_s1106" type="#_x0000_t75" style="position:absolute;left:2471;top:772;width:103;height:103">
               <v:imagedata r:id="rId18" o:title=""/>
             </v:shape>
-            <v:shape id="_x0000_s2129" type="#_x0000_t75" style="position:absolute;left:1616;top:772;width:103;height:103">
+            <v:shape id="_x0000_s1105" type="#_x0000_t75" style="position:absolute;left:1616;top:772;width:103;height:103">
               <v:imagedata r:id="rId17" o:title=""/>
             </v:shape>
-            <v:shape id="_x0000_s2128" style="position:absolute;left:1538;top:18;width:1161;height:396" coordorigin="1538,19" coordsize="1161,396" o:spt="100" adj="0,,0" path="m2529,198l2458,19,1538,394,2064,290,2401,153r26,65l2529,198xm2698,414l2664,240,1788,414r524,l2582,361r12,53l2698,414xe" fillcolor="#4489d6" stroked="f">
+            <v:shape id="_x0000_s1104" style="position:absolute;left:1538;top:18;width:1161;height:396" coordorigin="1538,19" coordsize="1161,396" o:spt="100" adj="0,,0" path="m2529,198l2458,19,1538,394,2064,290,2401,153r26,65l2529,198xm2698,414l2664,240,1788,414r524,l2582,361r12,53l2698,414xe" fillcolor="#4489d6" stroked="f">
               <v:stroke joinstyle="round"/>
               <v:formulas/>
               <v:path arrowok="t" o:connecttype="segments"/>
@@ -2927,7 +2909,7 @@
       </w:pPr>
       <w:r>
         <w:pict w14:anchorId="4756781A">
-          <v:shape id="_x0000_s2126" style="position:absolute;left:0;text-align:left;margin-left:182.1pt;margin-top:-.05pt;width:.2pt;height:10.05pt;z-index:15742976;visibility:visible;mso-position-horizontal-relative:page" coordorigin="3642,-1" coordsize="4,201" o:spt="100" adj="0,,0" path="m3645,199r-1,-2m3642,195r,-193m3642,1r2,-2e" filled="f" strokecolor="#b5082d" strokeweight=".14pt">
+          <v:shape id="_x0000_s1102" style="position:absolute;left:0;text-align:left;margin-left:182.1pt;margin-top:-.05pt;width:.2pt;height:10.05pt;z-index:15742976;visibility:visible;mso-position-horizontal-relative:page" coordorigin="3642,-1" coordsize="4,201" o:spt="100" adj="0,,0" path="m3645,199r-1,-2m3642,195r,-193m3642,1r2,-2e" filled="f" strokecolor="#b5082d" strokeweight=".14pt">
             <v:stroke joinstyle="round"/>
             <v:formulas/>
             <v:path arrowok="t" o:connecttype="segments"/>
@@ -3013,7 +2995,7 @@
       </w:pPr>
       <w:r>
         <w:pict w14:anchorId="4D3FE5FC">
-          <v:line id="_x0000_s2121" style="position:absolute;left:0;text-align:left;z-index:15744000;visibility:visible;mso-position-horizontal-relative:page" from="180.95pt,-2pt" to="283.25pt,-2pt" strokecolor="#0e6ec5" strokeweight=".19472mm">
+          <v:line id="_x0000_s1097" style="position:absolute;left:0;text-align:left;z-index:15744000;visibility:visible;mso-position-horizontal-relative:page" from="180.95pt,-2pt" to="283.25pt,-2pt" strokecolor="#0e6ec5" strokeweight=".19472mm">
             <v:stroke dashstyle="1 1"/>
             <w10:wrap anchorx="page"/>
           </v:line>
@@ -3118,8 +3100,8 @@
           <w:sz w:val="2"/>
         </w:rPr>
         <w:pict w14:anchorId="2FB7AA3D">
-          <v:group id="_x0000_s2119" style="width:102.3pt;height:.55pt;mso-position-horizontal-relative:char;mso-position-vertical-relative:line" coordsize="2046,11">
-            <v:rect id="_x0000_s2120" style="position:absolute;width:2046;height:11" fillcolor="#0e6ec5" stroked="f"/>
+          <v:group id="_x0000_s1095" style="width:102.3pt;height:.55pt;mso-position-horizontal-relative:char;mso-position-vertical-relative:line" coordsize="2046,11">
+            <v:rect id="_x0000_s1096" style="position:absolute;width:2046;height:11" fillcolor="#0e6ec5" stroked="f"/>
             <w10:anchorlock/>
           </v:group>
         </w:pict>
@@ -3492,8 +3474,8 @@
           <w:sz w:val="20"/>
         </w:rPr>
         <w:pict w14:anchorId="506AD3DF">
-          <v:shape id="_x0000_s2184" type="#_x0000_t202" style="width:362.6pt;height:16.3pt;visibility:visible;mso-left-percent:-10001;mso-top-percent:-10001;mso-position-horizontal:absolute;mso-position-horizontal-relative:char;mso-position-vertical:absolute;mso-position-vertical-relative:line;mso-left-percent:-10001;mso-top-percent:-10001" fillcolor="#c6e1f9" stroked="f">
-            <v:textbox style="mso-next-textbox:#_x0000_s2184" inset="0,0,0,0">
+          <v:shape id="_x0000_s1160" type="#_x0000_t202" style="width:362.6pt;height:16.3pt;visibility:visible;mso-left-percent:-10001;mso-top-percent:-10001;mso-position-horizontal:absolute;mso-position-horizontal-relative:char;mso-position-vertical:absolute;mso-position-vertical-relative:line;mso-left-percent:-10001;mso-top-percent:-10001" fillcolor="#c6e1f9" stroked="f">
+            <v:textbox style="mso-next-textbox:#_x0000_s1160" inset="0,0,0,0">
               <w:txbxContent>
                 <w:p>
                   <w:pPr>
@@ -3562,7 +3544,7 @@
       </w:pPr>
       <w:r>
         <w:pict w14:anchorId="2D4EEEA0">
-          <v:shape id="_x0000_s2116" style="position:absolute;left:0;text-align:left;margin-left:51.25pt;margin-top:-17.25pt;width:2.3pt;height:16.3pt;z-index:15744512;visibility:visible;mso-position-horizontal-relative:page" coordorigin="1025,-345" coordsize="46,326" o:spt="100" adj="0,,0" path="m1070,-299r-45,l1025,-65r,46l1070,-19r,-46l1070,-299xm1070,-345r-45,l1025,-299r45,l1070,-345xe" fillcolor="#c6e1f9" stroked="f">
+          <v:shape id="_x0000_s1092" style="position:absolute;left:0;text-align:left;margin-left:51.25pt;margin-top:-17.25pt;width:2.3pt;height:16.3pt;z-index:15744512;visibility:visible;mso-position-horizontal-relative:page" coordorigin="1025,-345" coordsize="46,326" o:spt="100" adj="0,,0" path="m1070,-299r-45,l1025,-65r,46l1070,-19r,-46l1070,-299xm1070,-345r-45,l1025,-299r45,l1070,-345xe" fillcolor="#c6e1f9" stroked="f">
             <v:stroke joinstyle="round"/>
             <v:formulas/>
             <v:path arrowok="t" o:connecttype="segments"/>
@@ -3572,7 +3554,7 @@
       </w:r>
       <w:r>
         <w:pict w14:anchorId="48253715">
-          <v:shape id="_x0000_s2115" style="position:absolute;left:0;text-align:left;margin-left:410.65pt;margin-top:-17.25pt;width:2.3pt;height:16.3pt;z-index:-16027648;visibility:visible;mso-position-horizontal-relative:page" coordorigin="8213,-345" coordsize="46,326" o:spt="100" adj="0,,0" path="m8259,-299r-46,l8213,-65r,46l8259,-19r,-46l8259,-299xm8259,-345r-46,l8213,-299r46,l8259,-345xe" fillcolor="#c6e1f9" stroked="f">
+          <v:shape id="_x0000_s1091" style="position:absolute;left:0;text-align:left;margin-left:410.65pt;margin-top:-17.25pt;width:2.3pt;height:16.3pt;z-index:-16027648;visibility:visible;mso-position-horizontal-relative:page" coordorigin="8213,-345" coordsize="46,326" o:spt="100" adj="0,,0" path="m8259,-299r-46,l8213,-65r,46l8259,-19r,-46l8259,-299xm8259,-345r-46,l8213,-299r46,l8259,-345xe" fillcolor="#c6e1f9" stroked="f">
             <v:stroke joinstyle="round"/>
             <v:formulas/>
             <v:path arrowok="t" o:connecttype="segments"/>
@@ -3621,22 +3603,22 @@
       </w:pPr>
       <w:r>
         <w:pict w14:anchorId="56BEFAFE">
-          <v:group id="_x0000_s2109" style="position:absolute;left:0;text-align:left;margin-left:67.15pt;margin-top:1.05pt;width:75.2pt;height:57.35pt;z-index:15747072;mso-position-horizontal-relative:page" coordorigin="1343,21" coordsize="1504,1147">
-            <v:shape id="_x0000_s2114" style="position:absolute;left:1343;top:485;width:1504;height:683" coordorigin="1343,485" coordsize="1504,683" o:spt="100" adj="0,,0" path="m2847,485r-1504,l1343,1167r1504,l2847,1065r-1333,l1446,997r,-341l1514,587r1333,l2847,485xm2847,587r-154,l2745,639r,375l2693,1065r154,l2847,587xe" fillcolor="#4489d6" stroked="f">
+          <v:group id="_x0000_s1085" style="position:absolute;left:0;text-align:left;margin-left:67.15pt;margin-top:1.05pt;width:75.2pt;height:57.35pt;z-index:15747072;mso-position-horizontal-relative:page" coordorigin="1343,21" coordsize="1504,1147">
+            <v:shape id="_x0000_s1090" style="position:absolute;left:1343;top:485;width:1504;height:683" coordorigin="1343,485" coordsize="1504,683" o:spt="100" adj="0,,0" path="m2847,485r-1504,l1343,1167r1504,l2847,1065r-1333,l1446,997r,-341l1514,587r1333,l2847,485xm2847,587r-154,l2745,639r,375l2693,1065r154,l2847,587xe" fillcolor="#4489d6" stroked="f">
               <v:stroke joinstyle="round"/>
               <v:formulas/>
               <v:path arrowok="t" o:connecttype="segments"/>
             </v:shape>
-            <v:shape id="_x0000_s2113" type="#_x0000_t75" style="position:absolute;left:1958;top:655;width:274;height:342">
+            <v:shape id="_x0000_s1089" type="#_x0000_t75" style="position:absolute;left:1958;top:655;width:274;height:342">
               <v:imagedata r:id="rId16" o:title=""/>
             </v:shape>
-            <v:shape id="_x0000_s2112" type="#_x0000_t75" style="position:absolute;left:1616;top:775;width:103;height:103">
+            <v:shape id="_x0000_s1088" type="#_x0000_t75" style="position:absolute;left:1616;top:775;width:103;height:103">
               <v:imagedata r:id="rId17" o:title=""/>
             </v:shape>
-            <v:shape id="_x0000_s2111" type="#_x0000_t75" style="position:absolute;left:2471;top:775;width:103;height:103">
+            <v:shape id="_x0000_s1087" type="#_x0000_t75" style="position:absolute;left:2471;top:775;width:103;height:103">
               <v:imagedata r:id="rId18" o:title=""/>
             </v:shape>
-            <v:shape id="_x0000_s2110" style="position:absolute;left:1538;top:21;width:1161;height:396" coordorigin="1538,21" coordsize="1161,396" o:spt="100" adj="0,,0" path="m2529,200l2458,21,1538,396,2064,292,2401,156r26,65l2529,200xm2698,417l2664,243,1788,417r524,l2582,364r12,53l2698,417xe" fillcolor="#4489d6" stroked="f">
+            <v:shape id="_x0000_s1086" style="position:absolute;left:1538;top:21;width:1161;height:396" coordorigin="1538,21" coordsize="1161,396" o:spt="100" adj="0,,0" path="m2529,200l2458,21,1538,396,2064,292,2401,156r26,65l2529,200xm2698,417l2664,243,1788,417r524,l2582,364r12,53l2698,417xe" fillcolor="#4489d6" stroked="f">
               <v:stroke joinstyle="round"/>
               <v:formulas/>
               <v:path arrowok="t" o:connecttype="segments"/>
@@ -3733,7 +3715,7 @@
       </w:pPr>
       <w:r>
         <w:pict w14:anchorId="77AFBE5B">
-          <v:line id="_x0000_s2108" style="position:absolute;left:0;text-align:left;z-index:15745536;visibility:visible;mso-position-horizontal-relative:page" from="180.95pt,-2.05pt" to="283.25pt,-2.05pt" strokecolor="#0e6ec5" strokeweight=".19472mm">
+          <v:line id="_x0000_s1084" style="position:absolute;left:0;text-align:left;z-index:15745536;visibility:visible;mso-position-horizontal-relative:page" from="180.95pt,-2.05pt" to="283.25pt,-2.05pt" strokecolor="#0e6ec5" strokeweight=".19472mm">
             <v:stroke dashstyle="1 1"/>
             <w10:wrap anchorx="page"/>
           </v:line>
@@ -3838,8 +3820,8 @@
           <w:sz w:val="2"/>
         </w:rPr>
         <w:pict w14:anchorId="6394115D">
-          <v:group id="_x0000_s2106" style="width:102.3pt;height:.6pt;mso-position-horizontal-relative:char;mso-position-vertical-relative:line" coordsize="2046,12">
-            <v:rect id="_x0000_s2107" style="position:absolute;width:2046;height:12" fillcolor="#0e6ec5" stroked="f"/>
+          <v:group id="_x0000_s1082" style="width:102.3pt;height:.6pt;mso-position-horizontal-relative:char;mso-position-vertical-relative:line" coordsize="2046,12">
+            <v:rect id="_x0000_s1083" style="position:absolute;width:2046;height:12" fillcolor="#0e6ec5" stroked="f"/>
             <w10:anchorlock/>
           </v:group>
         </w:pict>
@@ -4066,39 +4048,33 @@
       </w:pPr>
       <w:r>
         <w:pict w14:anchorId="426AF640">
-          <v:rect id="_x0000_s2105" style="position:absolute;margin-left:414.95pt;margin-top:95.45pt;width:196.7pt;height:600.65pt;z-index:-16032768;visibility:visible;mso-position-horizontal-relative:page;mso-position-vertical-relative:page" fillcolor="#f1f1f1" stroked="f">
+          <v:rect id="_x0000_s1081" style="position:absolute;margin-left:414.95pt;margin-top:95.45pt;width:196.7pt;height:600.65pt;z-index:-16032768;visibility:visible;mso-position-horizontal-relative:page;mso-position-vertical-relative:page" fillcolor="#f1f1f1" stroked="f">
             <w10:wrap anchorx="page" anchory="page"/>
           </v:rect>
         </w:pict>
       </w:r>
       <w:r>
         <w:pict w14:anchorId="1C75CA72">
-          <v:group id="_x0000_s2099" style="position:absolute;margin-left:51.25pt;margin-top:108.85pt;width:399.95pt;height:61.95pt;z-index:15740416;mso-position-horizontal-relative:page;mso-position-vertical-relative:page" coordorigin="1025,2177" coordsize="7999,1239">
-            <v:shape id="_x0000_s2104" type="#_x0000_t75" style="position:absolute;left:7256;top:2184;width:1760;height:1224">
+          <v:group id="_x0000_s1075" style="position:absolute;margin-left:51.25pt;margin-top:108.85pt;width:399.95pt;height:61.95pt;z-index:15740416;mso-position-horizontal-relative:page;mso-position-vertical-relative:page" coordorigin="1025,2177" coordsize="7999,1239">
+            <v:shape id="_x0000_s1080" type="#_x0000_t75" style="position:absolute;left:7256;top:2184;width:1760;height:1224">
               <v:imagedata r:id="rId7" o:title=""/>
             </v:shape>
-            <v:rect id="_x0000_s2103" style="position:absolute;left:7256;top:2184;width:1760;height:1224" filled="f" strokecolor="white" strokeweight=".26772mm"/>
-            <v:shape id="_x0000_s2102" style="position:absolute;left:1024;top:3000;width:7234;height:326" coordorigin="1025,3000" coordsize="7234,326" o:spt="100" adj="0,,0" path="m8213,3281r-7143,l1025,3281r,45l1070,3326r7143,l8213,3281xm8213,3046r-7143,l1025,3046r,235l1070,3281r7143,l8213,3046xm8213,3000r-7143,l1025,3000r,46l1070,3046r7143,l8213,3000xm8259,3281r-46,l8213,3326r46,l8259,3281xm8259,3046r-46,l8213,3281r46,l8259,3046xm8259,3000r-46,l8213,3046r46,l8259,3000xe" fillcolor="#c6e1f9" stroked="f">
+            <v:rect id="_x0000_s1079" style="position:absolute;left:7256;top:2184;width:1760;height:1224" filled="f" strokecolor="white" strokeweight=".26772mm"/>
+            <v:shape id="_x0000_s1078" style="position:absolute;left:1024;top:3000;width:7234;height:326" coordorigin="1025,3000" coordsize="7234,326" o:spt="100" adj="0,,0" path="m8213,3281r-7143,l1025,3281r,45l1070,3326r7143,l8213,3281xm8213,3046r-7143,l1025,3046r,235l1070,3281r7143,l8213,3046xm8213,3000r-7143,l1025,3000r,46l1070,3046r7143,l8213,3000xm8259,3281r-46,l8213,3326r46,l8259,3281xm8259,3046r-46,l8213,3281r46,l8259,3046xm8259,3000r-46,l8213,3046r46,l8259,3000xe" fillcolor="#c6e1f9" stroked="f">
               <v:stroke joinstyle="round"/>
               <v:formulas/>
               <v:path arrowok="t" o:connecttype="segments"/>
             </v:shape>
-            <v:shape id="_x0000_s2101" type="#_x0000_t202" style="position:absolute;left:1047;top:3000;width:7252;height:326" filled="f" stroked="f">
-              <v:textbox style="mso-next-textbox:#_x0000_s2101" inset="0,0,0,0">
+            <v:shape id="_x0000_s1077" type="#_x0000_t202" style="position:absolute;left:1047;top:3000;width:7252;height:326" filled="f" stroked="f">
+              <v:textbox style="mso-next-textbox:#_x0000_s1077" inset="0,0,0,0">
                 <w:txbxContent>
                   <w:p>
                     <w:pPr>
-                      <w:spacing w:before="51"/>
-                      <w:ind w:left="44"/>
-                      <w:rPr>
-                        <w:sz w:val="16"/>
-                      </w:rPr>
+                      <w:pStyle w:val="Heading2"/>
                     </w:pPr>
                     <w:r>
                       <w:rPr>
-                        <w:spacing w:val="9"/>
                         <w:w w:val="105"/>
-                        <w:sz w:val="16"/>
                       </w:rPr>
                       <w:t>WOODGROVE</w:t>
                     </w:r>
@@ -4106,14 +4082,12 @@
                       <w:rPr>
                         <w:spacing w:val="26"/>
                         <w:w w:val="105"/>
-                        <w:sz w:val="16"/>
                       </w:rPr>
                       <w:t xml:space="preserve"> </w:t>
                     </w:r>
                     <w:r>
                       <w:rPr>
                         <w:w w:val="105"/>
-                        <w:sz w:val="16"/>
                       </w:rPr>
                       <w:t>HIGH</w:t>
                     </w:r>
@@ -4121,15 +4095,12 @@
                       <w:rPr>
                         <w:spacing w:val="30"/>
                         <w:w w:val="105"/>
-                        <w:sz w:val="16"/>
                       </w:rPr>
                       <w:t xml:space="preserve"> </w:t>
                     </w:r>
                     <w:r>
                       <w:rPr>
-                        <w:spacing w:val="9"/>
                         <w:w w:val="105"/>
-                        <w:sz w:val="16"/>
                       </w:rPr>
                       <w:t>SCHOOL</w:t>
                     </w:r>
@@ -4137,15 +4108,12 @@
                       <w:rPr>
                         <w:spacing w:val="28"/>
                         <w:w w:val="105"/>
-                        <w:sz w:val="16"/>
                       </w:rPr>
                       <w:t xml:space="preserve"> </w:t>
                     </w:r>
                     <w:r>
                       <w:rPr>
-                        <w:spacing w:val="9"/>
                         <w:w w:val="105"/>
-                        <w:sz w:val="16"/>
                       </w:rPr>
                       <w:t>CHECKING</w:t>
                     </w:r>
@@ -4153,8 +4121,8 @@
                 </w:txbxContent>
               </v:textbox>
             </v:shape>
-            <v:shape id="_x0000_s2100" type="#_x0000_t202" style="position:absolute;left:8606;top:2345;width:113;height:183" filled="f" stroked="f">
-              <v:textbox style="mso-next-textbox:#_x0000_s2100" inset="0,0,0,0">
+            <v:shape id="_x0000_s1076" type="#_x0000_t202" style="position:absolute;left:8606;top:2345;width:113;height:183" filled="f" stroked="f">
+              <v:textbox style="mso-next-textbox:#_x0000_s1076" inset="0,0,0,0">
                 <w:txbxContent>
                   <w:p>
                     <w:pPr>
@@ -4181,7 +4149,7 @@
       </w:r>
       <w:r>
         <w:pict w14:anchorId="6DE43F0B">
-          <v:rect id="_x0000_s2098" style="position:absolute;margin-left:308.4pt;margin-top:177.8pt;width:102.3pt;height:.55pt;z-index:15741440;visibility:visible;mso-position-horizontal-relative:page;mso-position-vertical-relative:page" fillcolor="#0e6ec5" stroked="f">
+          <v:rect id="_x0000_s1074" style="position:absolute;margin-left:308.4pt;margin-top:177.8pt;width:102.3pt;height:.55pt;z-index:15741440;visibility:visible;mso-position-horizontal-relative:page;mso-position-vertical-relative:page" fillcolor="#0e6ec5" stroked="f">
             <w10:wrap anchorx="page" anchory="page"/>
           </v:rect>
         </w:pict>
@@ -4273,8 +4241,8 @@
           <w:sz w:val="8"/>
         </w:rPr>
         <w:pict w14:anchorId="65BDD28D">
-          <v:group id="_x0000_s2096" style="width:355pt;height:4.3pt;mso-position-horizontal-relative:char;mso-position-vertical-relative:line" coordsize="7100,86">
-            <v:shape id="_x0000_s2097" style="position:absolute;width:7100;height:86" coordsize="7100,86" path="m7100,l3555,,,,,86r3555,l7100,86r,-86xe" fillcolor="#0e6ec5" stroked="f">
+          <v:group id="_x0000_s1072" style="width:355pt;height:4.3pt;mso-position-horizontal-relative:char;mso-position-vertical-relative:line" coordsize="7100,86">
+            <v:shape id="_x0000_s1073" style="position:absolute;width:7100;height:86" coordsize="7100,86" path="m7100,l3555,,,,,86r3555,l7100,86r,-86xe" fillcolor="#0e6ec5" stroked="f">
               <v:path arrowok="t"/>
             </v:shape>
             <w10:anchorlock/>
@@ -4331,14 +4299,14 @@
       </w:pPr>
       <w:r>
         <w:pict w14:anchorId="31A635FD">
-          <v:group id="_x0000_s2065" style="position:absolute;left:0;text-align:left;margin-left:51.25pt;margin-top:150pt;width:359.4pt;height:87.8pt;z-index:-16018944;mso-position-horizontal-relative:page;mso-position-vertical-relative:page" coordorigin="1025,3000" coordsize="7274,2016">
-            <v:shape id="_x0000_s2070" style="position:absolute;left:1024;top:4021;width:7234;height:326" coordorigin="1025,4021" coordsize="7234,326" o:spt="100" adj="0,,0" path="m1070,4021r-45,l1025,4067r45,l1070,4021xm8213,4302r-7143,l1070,4067r-45,l1025,4302r,45l1070,4347r7143,l8213,4302xm8259,4067r-46,l8213,4302r,45l8259,4347r,-45l8259,4067xm8259,4021r-46,l8213,4067r46,l8259,4021xe" fillcolor="#c6e1f9" stroked="f">
+          <v:group id="_x0000_s1041" style="position:absolute;left:0;text-align:left;margin-left:51.25pt;margin-top:150pt;width:359.4pt;height:87.8pt;z-index:-16018944;mso-position-horizontal-relative:page;mso-position-vertical-relative:page" coordorigin="1025,3000" coordsize="7274,2016">
+            <v:shape id="_x0000_s1046" style="position:absolute;left:1024;top:4021;width:7234;height:326" coordorigin="1025,4021" coordsize="7234,326" o:spt="100" adj="0,,0" path="m1070,4021r-45,l1025,4067r45,l1070,4021xm8213,4302r-7143,l1070,4067r-45,l1025,4302r,45l1070,4347r7143,l8213,4302xm8259,4067r-46,l8213,4302r,45l8259,4347r,-45l8259,4067xm8259,4021r-46,l8213,4067r46,l8259,4021xe" fillcolor="#c6e1f9" stroked="f">
               <v:stroke joinstyle="round"/>
               <v:formulas/>
               <v:path arrowok="t" o:connecttype="segments"/>
             </v:shape>
-            <v:shape id="_x0000_s2069" type="#_x0000_t202" style="position:absolute;left:3640;top:4380;width:1828;height:636" filled="f" stroked="f">
-              <v:textbox style="mso-next-textbox:#_x0000_s2069" inset="0,0,0,0">
+            <v:shape id="_x0000_s1045" type="#_x0000_t202" style="position:absolute;left:3640;top:4380;width:1828;height:636" filled="f" stroked="f">
+              <v:textbox style="mso-next-textbox:#_x0000_s1045" inset="0,0,0,0">
                 <w:txbxContent>
                   <w:p>
                     <w:pPr>
@@ -4464,8 +4432,8 @@
                 </w:txbxContent>
               </v:textbox>
             </v:shape>
-            <v:shape id="_x0000_s2068" type="#_x0000_t202" style="position:absolute;left:1047;top:4021;width:7252;height:326" fillcolor="#c6e1f9" stroked="f">
-              <v:textbox style="mso-next-textbox:#_x0000_s2068" inset="0,0,0,0">
+            <v:shape id="_x0000_s1044" type="#_x0000_t202" style="position:absolute;left:1047;top:4021;width:7252;height:326" fillcolor="#c6e1f9" stroked="f">
+              <v:textbox style="mso-next-textbox:#_x0000_s1044" inset="0,0,0,0">
                 <w:txbxContent>
                   <w:p>
                     <w:pPr>
@@ -4503,8 +4471,8 @@
                 </w:txbxContent>
               </v:textbox>
             </v:shape>
-            <v:shape id="_x0000_s2067" type="#_x0000_t202" style="position:absolute;left:1024;top:3326;width:7274;height:695" filled="f" stroked="f">
-              <v:textbox style="mso-next-textbox:#_x0000_s2067" inset="0,0,0,0">
+            <v:shape id="_x0000_s1043" type="#_x0000_t202" style="position:absolute;left:1024;top:3326;width:7274;height:695" filled="f" stroked="f">
+              <v:textbox style="mso-next-textbox:#_x0000_s1043" inset="0,0,0,0">
                 <w:txbxContent>
                   <w:p>
                     <w:pPr>
@@ -4643,7 +4611,6 @@
                       </w:rPr>
                       <w:t xml:space="preserve"> </w:t>
                     </w:r>
-                    <w:proofErr w:type="spellStart"/>
                     <w:r>
                       <w:rPr>
                         <w:w w:val="105"/>
@@ -4651,7 +4618,6 @@
                       </w:rPr>
                       <w:t>Woodgrove</w:t>
                     </w:r>
-                    <w:proofErr w:type="spellEnd"/>
                     <w:r>
                       <w:rPr>
                         <w:spacing w:val="-5"/>
@@ -4720,7 +4686,6 @@
                       </w:rPr>
                       <w:t xml:space="preserve"> </w:t>
                     </w:r>
-                    <w:proofErr w:type="spellStart"/>
                     <w:r>
                       <w:rPr>
                         <w:w w:val="105"/>
@@ -4728,7 +4693,6 @@
                       </w:rPr>
                       <w:t>Woodgrove</w:t>
                     </w:r>
-                    <w:proofErr w:type="spellEnd"/>
                     <w:r>
                       <w:rPr>
                         <w:spacing w:val="-35"/>
@@ -4741,8 +4705,8 @@
                 </w:txbxContent>
               </v:textbox>
             </v:shape>
-            <v:shape id="_x0000_s2066" type="#_x0000_t202" style="position:absolute;left:1047;top:3000;width:7252;height:326" filled="f" stroked="f">
-              <v:textbox style="mso-next-textbox:#_x0000_s2066" inset="0,0,0,0">
+            <v:shape id="_x0000_s1042" type="#_x0000_t202" style="position:absolute;left:1047;top:3000;width:7252;height:326" filled="f" stroked="f">
+              <v:textbox style="mso-next-textbox:#_x0000_s1042" inset="0,0,0,0">
                 <w:txbxContent>
                   <w:p>
                     <w:pPr>
@@ -4797,18 +4761,18 @@
           <w:sz w:val="20"/>
         </w:rPr>
         <w:pict w14:anchorId="38A5C6FD">
-          <v:group id="_x0000_s2091" style="width:399.95pt;height:61.95pt;mso-position-horizontal-relative:char;mso-position-vertical-relative:line" coordsize="7999,1239">
-            <v:shape id="_x0000_s2095" type="#_x0000_t75" style="position:absolute;left:6231;top:7;width:1760;height:1224">
+          <v:group id="_x0000_s1067" style="width:399.95pt;height:61.95pt;mso-position-horizontal-relative:char;mso-position-vertical-relative:line" coordsize="7999,1239">
+            <v:shape id="_x0000_s1071" type="#_x0000_t75" style="position:absolute;left:6231;top:7;width:1760;height:1224">
               <v:imagedata r:id="rId7" o:title=""/>
             </v:shape>
-            <v:rect id="_x0000_s2094" style="position:absolute;left:6231;top:7;width:1760;height:1224" filled="f" strokecolor="white" strokeweight=".26772mm"/>
-            <v:shape id="_x0000_s2093" style="position:absolute;top:823;width:7234;height:326" coordorigin=",824" coordsize="7234,326" o:spt="100" adj="0,,0" path="m7188,1104r-7142,l,1104r,46l46,1150r7142,l7188,1104xm7188,869l46,869,,869r,235l46,1104r7142,l7188,869xm7188,824l46,824,,824r,45l46,869r7142,l7188,824xm7234,1104r-46,l7188,1150r46,l7234,1104xm7234,869r-46,l7188,1104r46,l7234,869xm7234,824r-46,l7188,869r46,l7234,824xe" fillcolor="#0e6ec5" stroked="f">
+            <v:rect id="_x0000_s1070" style="position:absolute;left:6231;top:7;width:1760;height:1224" filled="f" strokecolor="white" strokeweight=".26772mm"/>
+            <v:shape id="_x0000_s1069" style="position:absolute;top:823;width:7234;height:326" coordorigin=",824" coordsize="7234,326" o:spt="100" adj="0,,0" path="m7188,1104r-7142,l,1104r,46l46,1150r7142,l7188,1104xm7188,869l46,869,,869r,235l46,1104r7142,l7188,869xm7188,824l46,824,,824r,45l46,869r7142,l7188,824xm7234,1104r-46,l7188,1150r46,l7234,1104xm7234,869r-46,l7188,1104r46,l7234,869xm7234,824r-46,l7188,869r46,l7234,824xe" fillcolor="#0e6ec5" stroked="f">
               <v:stroke joinstyle="round"/>
               <v:formulas/>
               <v:path arrowok="t" o:connecttype="segments"/>
             </v:shape>
-            <v:shape id="_x0000_s2092" type="#_x0000_t202" style="position:absolute;left:7581;top:168;width:113;height:183" filled="f" stroked="f">
-              <v:textbox style="mso-next-textbox:#_x0000_s2092" inset="0,0,0,0">
+            <v:shape id="_x0000_s1068" type="#_x0000_t202" style="position:absolute;left:7581;top:168;width:113;height:183" filled="f" stroked="f">
+              <v:textbox style="mso-next-textbox:#_x0000_s1068" inset="0,0,0,0">
                 <w:txbxContent>
                   <w:p>
                     <w:pPr>
@@ -4868,7 +4832,7 @@
       </w:pPr>
       <w:r>
         <w:pict w14:anchorId="4ACFB81E">
-          <v:rect id="_x0000_s2090" style="position:absolute;margin-left:308.4pt;margin-top:12.6pt;width:102.3pt;height:.55pt;z-index:-15707648;mso-wrap-distance-left:0;mso-wrap-distance-right:0;mso-position-horizontal-relative:page" fillcolor="#0e6ec5" stroked="f">
+          <v:rect id="_x0000_s1066" style="position:absolute;margin-left:308.4pt;margin-top:12.6pt;width:102.3pt;height:.55pt;z-index:-15707648;mso-wrap-distance-left:0;mso-wrap-distance-right:0;mso-position-horizontal-relative:page" fillcolor="#0e6ec5" stroked="f">
             <w10:wrap type="topAndBottom" anchorx="page"/>
           </v:rect>
         </w:pict>
@@ -4903,8 +4867,8 @@
           <w:sz w:val="20"/>
         </w:rPr>
         <w:pict w14:anchorId="64C30554">
-          <v:group id="_x0000_s2088" style="width:72.65pt;height:54pt;mso-position-horizontal-relative:char;mso-position-vertical-relative:line" coordsize="1453,1080">
-            <v:shape id="_x0000_s2089" style="position:absolute;width:1453;height:1080" coordsize="1453,1080" o:spt="100" adj="0,,0" path="m181,r-9,4l167,12r,10l236,215r-30,33l180,284r-23,38l137,362r-4,10l125,379r-12,3l51,397r-21,9l14,421,4,441,,464,,597r4,22l14,638r16,16l51,663r63,16l125,682r8,7l138,699r25,49l193,793r35,43l272,880r5,7l279,895r25,156l309,1062r7,10l326,1077r12,3l451,1080r12,-3l473,1072r8,-10l485,1051r9,-55l741,996r14,-3l956,993r16,-98l974,887r4,-7l984,875r59,-58l1092,753r38,-69l1154,609r8,-77l1162,530r-1,-21l1160,488r-4,-21l1152,447r15,-5l1183,438r16,-2l1215,435r168,l1381,432r-16,-18l1378,412r12,-1l1402,410r25,l1439,405r9,-10l1453,382r-322,l1099,320r-41,-57l1028,232r-230,l793,230r-3,-2l748,212r-27,-8l507,204r-12,-4l485,191r-7,-12l477,165r4,-12l490,143r12,-7l531,130r29,-5l588,122r29,-1l878,121,836,101r-434,l191,2,181,xm956,993r-201,l766,1051r4,11l778,1072r10,5l800,1080r113,l925,1077r10,-5l942,1062r5,-11l956,993xm741,996r-247,l524,1003r30,5l585,1010r32,1l652,1010r35,-4l721,1001r20,-5xm1383,435r-168,l1207,449r-6,15l1198,480r-2,16l1198,521r6,24l1215,567r15,20l1245,599r17,10l1280,615r19,2l1339,608r32,-25l1392,547r-102,l1283,542r-5,-5l1273,530r-5,-10l1266,509r-1,-11l1267,482r7,-13l1283,457r11,-8l1295,447r94,l1383,435xm1389,447r-94,l1315,460r11,12l1332,484r1,12l1330,516r-7,16l1312,543r-13,4l1392,547r1,-2l1401,498r-2,-24l1392,452r-3,-5xm1427,410r-25,l1413,411r14,l1427,410xm1214,367r-41,4l1131,382r322,l1452,372r-167,l1252,367r-38,xm1390,341r-36,5l1319,356r-34,16l1452,372r-1,-4l1446,357r-10,-9l1424,343r-34,-2xm878,121r-261,l666,124r51,8l767,146r48,19l827,174r8,11l837,198r-3,13l829,223r-14,9l1028,232r-19,-20l953,166,891,127r-13,-6xm619,189r-25,1l570,193r-24,4l521,203r-14,1l721,204r-16,-5l661,192r-42,-3xm615,53r-55,3l506,65,453,80r-51,21l836,101,825,96,757,72,686,58,615,53xe" fillcolor="#4489d6" stroked="f">
+          <v:group id="_x0000_s1064" style="width:72.65pt;height:54pt;mso-position-horizontal-relative:char;mso-position-vertical-relative:line" coordsize="1453,1080">
+            <v:shape id="_x0000_s1065" style="position:absolute;width:1453;height:1080" coordsize="1453,1080" o:spt="100" adj="0,,0" path="m181,r-9,4l167,12r,10l236,215r-30,33l180,284r-23,38l137,362r-4,10l125,379r-12,3l51,397r-21,9l14,421,4,441,,464,,597r4,22l14,638r16,16l51,663r63,16l125,682r8,7l138,699r25,49l193,793r35,43l272,880r5,7l279,895r25,156l309,1062r7,10l326,1077r12,3l451,1080r12,-3l473,1072r8,-10l485,1051r9,-55l741,996r14,-3l956,993r16,-98l974,887r4,-7l984,875r59,-58l1092,753r38,-69l1154,609r8,-77l1162,530r-1,-21l1160,488r-4,-21l1152,447r15,-5l1183,438r16,-2l1215,435r168,l1381,432r-16,-18l1378,412r12,-1l1402,410r25,l1439,405r9,-10l1453,382r-322,l1099,320r-41,-57l1028,232r-230,l793,230r-3,-2l748,212r-27,-8l507,204r-12,-4l485,191r-7,-12l477,165r4,-12l490,143r12,-7l531,130r29,-5l588,122r29,-1l878,121,836,101r-434,l191,2,181,xm956,993r-201,l766,1051r4,11l778,1072r10,5l800,1080r113,l925,1077r10,-5l942,1062r5,-11l956,993xm741,996r-247,l524,1003r30,5l585,1010r32,1l652,1010r35,-4l721,1001r20,-5xm1383,435r-168,l1207,449r-6,15l1198,480r-2,16l1198,521r6,24l1215,567r15,20l1245,599r17,10l1280,615r19,2l1339,608r32,-25l1392,547r-102,l1283,542r-5,-5l1273,530r-5,-10l1266,509r-1,-11l1267,482r7,-13l1283,457r11,-8l1295,447r94,l1383,435xm1389,447r-94,l1315,460r11,12l1332,484r1,12l1330,516r-7,16l1312,543r-13,4l1392,547r1,-2l1401,498r-2,-24l1392,452r-3,-5xm1427,410r-25,l1413,411r14,l1427,410xm1214,367r-41,4l1131,382r322,l1452,372r-167,l1252,367r-38,xm1390,341r-36,5l1319,356r-34,16l1452,372r-1,-4l1446,357r-10,-9l1424,343r-34,-2xm878,121r-261,l666,124r51,8l767,146r48,19l827,174r8,11l837,198r-3,13l829,223r-14,9l1028,232r-19,-20l953,166,891,127r-13,-6xm619,189r-25,1l570,193r-24,4l521,203r-14,1l721,204r-16,-5l661,192r-42,-3xm615,53r-55,3l506,65,453,80r-51,21l836,101,825,96,757,72,686,58,615,53xe" fillcolor="#4489d6" stroked="f">
               <v:stroke joinstyle="round"/>
               <v:formulas/>
               <v:path arrowok="t" o:connecttype="segments"/>
@@ -4931,8 +4895,8 @@
           <w:sz w:val="20"/>
         </w:rPr>
         <w:pict w14:anchorId="0FD02ED1">
-          <v:shape id="_x0000_s2183" type="#_x0000_t202" style="width:89.55pt;height:23.85pt;mso-left-percent:-10001;mso-top-percent:-10001;mso-position-horizontal:absolute;mso-position-horizontal-relative:char;mso-position-vertical:absolute;mso-position-vertical-relative:line;mso-left-percent:-10001;mso-top-percent:-10001" filled="f" stroked="f">
-            <v:textbox style="mso-next-textbox:#_x0000_s2183" inset="0,0,0,0">
+          <v:shape id="_x0000_s1159" type="#_x0000_t202" style="width:89.55pt;height:23.85pt;mso-left-percent:-10001;mso-top-percent:-10001;mso-position-horizontal:absolute;mso-position-horizontal-relative:char;mso-position-vertical:absolute;mso-position-vertical-relative:line;mso-left-percent:-10001;mso-top-percent:-10001" filled="f" stroked="f">
+            <v:textbox style="mso-next-textbox:#_x0000_s1159" inset="0,0,0,0">
               <w:txbxContent>
                 <w:p>
                   <w:pPr>
@@ -5006,8 +4970,8 @@
       </w:pPr>
       <w:r>
         <w:pict w14:anchorId="40A0BACD">
-          <v:shape id="_x0000_s2086" type="#_x0000_t202" style="position:absolute;margin-left:309.45pt;margin-top:14.7pt;width:88.65pt;height:31.75pt;z-index:-15706112;mso-wrap-distance-left:0;mso-wrap-distance-right:0;mso-position-horizontal-relative:page" filled="f" stroked="f">
-            <v:textbox style="mso-next-textbox:#_x0000_s2086" inset="0,0,0,0">
+          <v:shape id="_x0000_s1062" type="#_x0000_t202" style="position:absolute;margin-left:309.45pt;margin-top:14.7pt;width:88.65pt;height:31.75pt;z-index:-15706112;mso-wrap-distance-left:0;mso-wrap-distance-right:0;mso-position-horizontal-relative:page" filled="f" stroked="f">
+            <v:textbox style="mso-next-textbox:#_x0000_s1062" inset="0,0,0,0">
               <w:txbxContent>
                 <w:p>
                   <w:pPr>
@@ -5203,8 +5167,8 @@
           <w:sz w:val="20"/>
         </w:rPr>
         <w:pict w14:anchorId="21086C9F">
-          <v:shape id="_x0000_s2182" type="#_x0000_t202" style="width:362.6pt;height:16.3pt;mso-left-percent:-10001;mso-top-percent:-10001;mso-position-horizontal:absolute;mso-position-horizontal-relative:char;mso-position-vertical:absolute;mso-position-vertical-relative:line;mso-left-percent:-10001;mso-top-percent:-10001" fillcolor="#c6e1f9" stroked="f">
-            <v:textbox style="mso-next-textbox:#_x0000_s2182" inset="0,0,0,0">
+          <v:shape id="_x0000_s1158" type="#_x0000_t202" style="width:362.6pt;height:16.3pt;mso-left-percent:-10001;mso-top-percent:-10001;mso-position-horizontal:absolute;mso-position-horizontal-relative:char;mso-position-vertical:absolute;mso-position-vertical-relative:line;mso-left-percent:-10001;mso-top-percent:-10001" fillcolor="#c6e1f9" stroked="f">
+            <v:textbox style="mso-next-textbox:#_x0000_s1158" inset="0,0,0,0">
               <w:txbxContent>
                 <w:p>
                   <w:pPr>
@@ -5273,7 +5237,7 @@
       </w:pPr>
       <w:r>
         <w:pict w14:anchorId="5B3BDB10">
-          <v:shape id="_x0000_s2084" style="position:absolute;left:0;text-align:left;margin-left:51.25pt;margin-top:-17.25pt;width:2.3pt;height:16.3pt;z-index:15754240;mso-position-horizontal-relative:page" coordorigin="1025,-345" coordsize="46,326" o:spt="100" adj="0,,0" path="m1070,-65r-45,l1025,-19r45,l1070,-65xm1070,-345r-45,l1025,-300r,235l1070,-65r,-235l1070,-345xe" fillcolor="#c6e1f9" stroked="f">
+          <v:shape id="_x0000_s1060" style="position:absolute;left:0;text-align:left;margin-left:51.25pt;margin-top:-17.25pt;width:2.3pt;height:16.3pt;z-index:15754240;mso-position-horizontal-relative:page" coordorigin="1025,-345" coordsize="46,326" o:spt="100" adj="0,,0" path="m1070,-65r-45,l1025,-19r45,l1070,-65xm1070,-345r-45,l1025,-300r,235l1070,-65r,-235l1070,-345xe" fillcolor="#c6e1f9" stroked="f">
             <v:stroke joinstyle="round"/>
             <v:formulas/>
             <v:path arrowok="t" o:connecttype="segments"/>
@@ -5283,8 +5247,8 @@
       </w:r>
       <w:r>
         <w:pict w14:anchorId="224FE3B5">
-          <v:shape id="_x0000_s2083" type="#_x0000_t202" style="position:absolute;left:0;text-align:left;margin-left:309.45pt;margin-top:-104.8pt;width:95.8pt;height:31.8pt;z-index:15756800;mso-position-horizontal-relative:page" filled="f" stroked="f">
-            <v:textbox style="mso-next-textbox:#_x0000_s2083" inset="0,0,0,0">
+          <v:shape id="_x0000_s1059" type="#_x0000_t202" style="position:absolute;left:0;text-align:left;margin-left:309.45pt;margin-top:-104.8pt;width:95.8pt;height:31.8pt;z-index:15756800;mso-position-horizontal-relative:page" filled="f" stroked="f">
+            <v:textbox style="mso-next-textbox:#_x0000_s1059" inset="0,0,0,0">
               <w:txbxContent>
                 <w:p>
                   <w:pPr>
@@ -5421,8 +5385,8 @@
       </w:r>
       <w:r>
         <w:pict w14:anchorId="6DDF69FF">
-          <v:shape id="_x0000_s2082" type="#_x0000_t202" style="position:absolute;left:0;text-align:left;margin-left:182.05pt;margin-top:-102.8pt;width:91.8pt;height:20.1pt;z-index:15757312;mso-position-horizontal-relative:page" filled="f" stroked="f">
-            <v:textbox style="mso-next-textbox:#_x0000_s2082" inset="0,0,0,0">
+          <v:shape id="_x0000_s1058" type="#_x0000_t202" style="position:absolute;left:0;text-align:left;margin-left:182.05pt;margin-top:-102.8pt;width:91.8pt;height:20.1pt;z-index:15757312;mso-position-horizontal-relative:page" filled="f" stroked="f">
+            <v:textbox style="mso-next-textbox:#_x0000_s1058" inset="0,0,0,0">
               <w:txbxContent>
                 <w:p>
                   <w:pPr>
@@ -5532,14 +5496,12 @@
         </w:rPr>
         <w:t xml:space="preserve"> </w:t>
       </w:r>
-      <w:proofErr w:type="spellStart"/>
       <w:r>
         <w:rPr>
           <w:w w:val="105"/>
         </w:rPr>
         <w:t>Woodgrove</w:t>
       </w:r>
-      <w:proofErr w:type="spellEnd"/>
     </w:p>
     <w:p>
       <w:pPr>
@@ -5549,7 +5511,7 @@
       </w:pPr>
       <w:r>
         <w:pict w14:anchorId="2EF25446">
-          <v:shape id="_x0000_s2081" style="position:absolute;left:0;text-align:left;margin-left:69.75pt;margin-top:4.5pt;width:72.65pt;height:54pt;z-index:15756288;mso-position-horizontal-relative:page" coordorigin="1395,90" coordsize="1453,1080" o:spt="100" adj="0,,0" path="m1576,90r-9,4l1562,102r,10l1630,305r-29,33l1574,374r-23,38l1531,451r-3,11l1519,469r-12,3l1446,487r-21,9l1409,511r-11,20l1395,554r,133l1398,709r11,19l1425,744r21,9l1509,769r10,3l1528,779r5,10l1558,838r29,45l1622,926r44,44l1671,977r2,8l1699,1141r4,11l1711,1161r10,6l1733,1170r113,l1858,1167r10,-6l1876,1152r4,-11l1888,1086r247,l2150,1083r201,l2367,985r2,-8l2372,970r7,-5l2437,907r50,-64l2524,774r24,-75l2556,622r1,-2l2556,599r-2,-21l2551,557r-5,-20l2562,532r16,-4l2594,526r16,-1l2777,525r-1,-3l2760,504r13,-2l2785,501r11,-1l2822,500r11,-5l2842,485r5,-13l2526,472r-32,-62l2453,353r-30,-31l2193,322r-5,-2l2184,318r-42,-16l2116,294r-214,l1889,290r-10,-9l1873,269r-1,-14l1876,243r9,-10l1897,226r28,-6l1954,215r29,-3l2012,211r261,l2230,191r-434,l1586,92r-10,-2xm2351,1083r-201,l2160,1141r5,11l2172,1161r10,6l2194,1170r113,l2319,1167r10,-6l2337,1152r4,-11l2351,1083xm2135,1086r-247,l1918,1093r31,5l1980,1100r32,1l2046,1100r35,-4l2116,1091r19,-5xm2777,525r-167,l2602,539r-6,15l2592,570r-1,16l2592,611r7,24l2610,657r15,20l2640,689r17,10l2675,705r18,2l2733,698r33,-25l2786,637r-101,l2678,632r-5,-5l2667,620r-4,-10l2660,599r-1,-11l2662,572r7,-13l2678,547r10,-9l2690,537r94,l2777,525xm2784,537r-94,l2710,550r11,12l2726,574r2,12l2725,606r-7,16l2707,633r-14,4l2786,637r2,-2l2796,588r-2,-24l2787,542r-3,-5xm2822,500r-26,l2808,501r13,-1l2822,500xm2609,457r-42,4l2526,472r321,l2846,462r-166,l2647,457r-38,xm2784,431r-35,5l2713,446r-33,16l2846,462r,-4l2840,447r-9,-9l2818,433r-34,-2xm2273,211r-261,l2061,214r50,8l2161,236r49,19l2222,264r7,11l2232,288r-3,13l2223,313r-13,9l2423,322r-20,-20l2347,256r-61,-39l2273,211xm2013,279r-24,1l1965,283r-25,4l1916,293r-14,1l2116,294r-17,-5l2056,282r-43,-3xm2010,143r-55,3l1900,155r-53,15l1796,191r434,l2220,186r-69,-24l2081,148r-71,-5xe" fillcolor="#4489d6" stroked="f">
+          <v:shape id="_x0000_s1057" style="position:absolute;left:0;text-align:left;margin-left:69.75pt;margin-top:4.5pt;width:72.65pt;height:54pt;z-index:15756288;mso-position-horizontal-relative:page" coordorigin="1395,90" coordsize="1453,1080" o:spt="100" adj="0,,0" path="m1576,90r-9,4l1562,102r,10l1630,305r-29,33l1574,374r-23,38l1531,451r-3,11l1519,469r-12,3l1446,487r-21,9l1409,511r-11,20l1395,554r,133l1398,709r11,19l1425,744r21,9l1509,769r10,3l1528,779r5,10l1558,838r29,45l1622,926r44,44l1671,977r2,8l1699,1141r4,11l1711,1161r10,6l1733,1170r113,l1858,1167r10,-6l1876,1152r4,-11l1888,1086r247,l2150,1083r201,l2367,985r2,-8l2372,970r7,-5l2437,907r50,-64l2524,774r24,-75l2556,622r1,-2l2556,599r-2,-21l2551,557r-5,-20l2562,532r16,-4l2594,526r16,-1l2777,525r-1,-3l2760,504r13,-2l2785,501r11,-1l2822,500r11,-5l2842,485r5,-13l2526,472r-32,-62l2453,353r-30,-31l2193,322r-5,-2l2184,318r-42,-16l2116,294r-214,l1889,290r-10,-9l1873,269r-1,-14l1876,243r9,-10l1897,226r28,-6l1954,215r29,-3l2012,211r261,l2230,191r-434,l1586,92r-10,-2xm2351,1083r-201,l2160,1141r5,11l2172,1161r10,6l2194,1170r113,l2319,1167r10,-6l2337,1152r4,-11l2351,1083xm2135,1086r-247,l1918,1093r31,5l1980,1100r32,1l2046,1100r35,-4l2116,1091r19,-5xm2777,525r-167,l2602,539r-6,15l2592,570r-1,16l2592,611r7,24l2610,657r15,20l2640,689r17,10l2675,705r18,2l2733,698r33,-25l2786,637r-101,l2678,632r-5,-5l2667,620r-4,-10l2660,599r-1,-11l2662,572r7,-13l2678,547r10,-9l2690,537r94,l2777,525xm2784,537r-94,l2710,550r11,12l2726,574r2,12l2725,606r-7,16l2707,633r-14,4l2786,637r2,-2l2796,588r-2,-24l2787,542r-3,-5xm2822,500r-26,l2808,501r13,-1l2822,500xm2609,457r-42,4l2526,472r321,l2846,462r-166,l2647,457r-38,xm2784,431r-35,5l2713,446r-33,16l2846,462r,-4l2840,447r-9,-9l2818,433r-34,-2xm2273,211r-261,l2061,214r50,8l2161,236r49,19l2222,264r7,11l2232,288r-3,13l2223,313r-13,9l2423,322r-20,-20l2347,256r-61,-39l2273,211xm2013,279r-24,1l1965,283r-25,4l1916,293r-14,1l2116,294r-17,-5l2056,282r-43,-3xm2010,143r-55,3l1900,155r-53,15l1796,191r434,l2220,186r-69,-24l2081,148r-71,-5xe" fillcolor="#4489d6" stroked="f">
             <v:stroke joinstyle="round"/>
             <v:formulas/>
             <v:path arrowok="t" o:connecttype="segments"/>
@@ -5561,16 +5523,8 @@
         <w:rPr>
           <w:w w:val="105"/>
         </w:rPr>
-        <w:t xml:space="preserve">Savings plus no </w:t>
-      </w:r>
-      <w:proofErr w:type="spellStart"/>
-      <w:r>
-        <w:rPr>
-          <w:w w:val="105"/>
-        </w:rPr>
-        <w:t>Woodgrove</w:t>
-      </w:r>
-      <w:proofErr w:type="spellEnd"/>
+        <w:t>Savings plus no Woodgrove</w:t>
+      </w:r>
       <w:r>
         <w:rPr>
           <w:spacing w:val="1"/>
@@ -5608,16 +5562,8 @@
         <w:rPr>
           <w:w w:val="105"/>
         </w:rPr>
-        <w:t>non-</w:t>
-      </w:r>
-      <w:proofErr w:type="spellStart"/>
-      <w:r>
-        <w:rPr>
-          <w:w w:val="105"/>
-        </w:rPr>
-        <w:t>Woodgrove</w:t>
-      </w:r>
-      <w:proofErr w:type="spellEnd"/>
+        <w:t>non-Woodgrove</w:t>
+      </w:r>
       <w:r>
         <w:rPr>
           <w:spacing w:val="-8"/>
@@ -5749,8 +5695,8 @@
           <w:sz w:val="2"/>
         </w:rPr>
         <w:pict w14:anchorId="56935C77">
-          <v:group id="_x0000_s2079" style="width:102.3pt;height:.55pt;mso-position-horizontal-relative:char;mso-position-vertical-relative:line" coordsize="2046,11">
-            <v:rect id="_x0000_s2080" style="position:absolute;width:2046;height:11" fillcolor="#0e6ec5" stroked="f"/>
+          <v:group id="_x0000_s1055" style="width:102.3pt;height:.55pt;mso-position-horizontal-relative:char;mso-position-vertical-relative:line" coordsize="2046,11">
+            <v:rect id="_x0000_s1056" style="position:absolute;width:2046;height:11" fillcolor="#0e6ec5" stroked="f"/>
             <w10:anchorlock/>
           </v:group>
         </w:pict>
@@ -5764,7 +5710,7 @@
       </w:pPr>
       <w:r>
         <w:pict w14:anchorId="6E4F2E19">
-          <v:shape id="_x0000_s2078" style="position:absolute;left:0;text-align:left;margin-left:410.65pt;margin-top:-21.2pt;width:2.3pt;height:16.3pt;z-index:-16017920;mso-position-horizontal-relative:page" coordorigin="8213,-424" coordsize="46,326" o:spt="100" adj="0,,0" path="m8259,-144r-46,l8213,-99r46,l8259,-144xm8259,-424r-46,l8213,-379r,235l8259,-144r,-235l8259,-424xe" fillcolor="#c6e1f9" stroked="f">
+          <v:shape id="_x0000_s1054" style="position:absolute;left:0;text-align:left;margin-left:410.65pt;margin-top:-21.2pt;width:2.3pt;height:16.3pt;z-index:-16017920;mso-position-horizontal-relative:page" coordorigin="8213,-424" coordsize="46,326" o:spt="100" adj="0,,0" path="m8259,-144r-46,l8213,-99r46,l8259,-144xm8259,-424r-46,l8213,-379r,235l8259,-144r,-235l8259,-424xe" fillcolor="#c6e1f9" stroked="f">
             <v:stroke joinstyle="round"/>
             <v:formulas/>
             <v:path arrowok="t" o:connecttype="segments"/>
@@ -5842,7 +5788,7 @@
       </w:pPr>
       <w:r>
         <w:pict w14:anchorId="6EA8725C">
-          <v:shape id="_x0000_s2077" style="position:absolute;left:0;text-align:left;margin-left:309.5pt;margin-top:23.35pt;width:.2pt;height:10.05pt;z-index:15755264;mso-position-horizontal-relative:page" coordorigin="6190,467" coordsize="4,201" o:spt="100" adj="0,,0" path="m6194,667r-2,-2m6190,663r,-193m6190,469r2,-2e" filled="f" strokecolor="#b5082d" strokeweight=".14pt">
+          <v:shape id="_x0000_s1053" style="position:absolute;left:0;text-align:left;margin-left:309.5pt;margin-top:23.35pt;width:.2pt;height:10.05pt;z-index:15755264;mso-position-horizontal-relative:page" coordorigin="6190,467" coordsize="4,201" o:spt="100" adj="0,,0" path="m6194,667r-2,-2m6190,663r,-193m6190,469r2,-2e" filled="f" strokecolor="#b5082d" strokeweight=".14pt">
             <v:stroke joinstyle="round"/>
             <v:formulas/>
             <v:path arrowok="t" o:connecttype="segments"/>
@@ -6005,7 +5951,7 @@
       </w:pPr>
       <w:r>
         <w:pict w14:anchorId="386C6688">
-          <v:rect id="_x0000_s2071" style="position:absolute;margin-left:414.95pt;margin-top:95.45pt;width:196.7pt;height:600.65pt;z-index:-16019456;mso-position-horizontal-relative:page;mso-position-vertical-relative:page" fillcolor="#f1f1f1" stroked="f">
+          <v:rect id="_x0000_s1047" style="position:absolute;margin-left:414.95pt;margin-top:95.45pt;width:196.7pt;height:600.65pt;z-index:-16019456;mso-position-horizontal-relative:page;mso-position-vertical-relative:page" fillcolor="#f1f1f1" stroked="f">
             <w10:wrap anchorx="page" anchory="page"/>
           </v:rect>
         </w:pict>
@@ -6169,8 +6115,8 @@
           <w:sz w:val="8"/>
         </w:rPr>
         <w:pict w14:anchorId="41C84470">
-          <v:group id="_x0000_s2063" style="width:355pt;height:4.3pt;mso-position-horizontal-relative:char;mso-position-vertical-relative:line" coordsize="7100,86">
-            <v:shape id="_x0000_s2064" style="position:absolute;width:7100;height:86" coordsize="7100,86" path="m7100,l3555,,,,,86r3555,l7100,86r,-86xe" fillcolor="#0e6ec5" stroked="f">
+          <v:group id="_x0000_s1039" style="width:355pt;height:4.3pt;mso-position-horizontal-relative:char;mso-position-vertical-relative:line" coordsize="7100,86">
+            <v:shape id="_x0000_s1040" style="position:absolute;width:7100;height:86" coordsize="7100,86" path="m7100,l3555,,,,,86r3555,l7100,86r,-86xe" fillcolor="#0e6ec5" stroked="f">
               <v:path arrowok="t"/>
             </v:shape>
             <w10:anchorlock/>
@@ -6202,7 +6148,7 @@
       <w:r>
         <w:lastRenderedPageBreak/>
         <w:pict w14:anchorId="3AF65DB8">
-          <v:rect id="_x0000_s2062" style="position:absolute;margin-left:414.95pt;margin-top:95.45pt;width:196.7pt;height:600.65pt;z-index:-16013824;visibility:visible;mso-position-horizontal-relative:page;mso-position-vertical-relative:page" fillcolor="#f1f1f1" stroked="f">
+          <v:rect id="_x0000_s1038" style="position:absolute;margin-left:414.95pt;margin-top:95.45pt;width:196.7pt;height:600.65pt;z-index:-16013824;visibility:visible;mso-position-horizontal-relative:page;mso-position-vertical-relative:page" fillcolor="#f1f1f1" stroked="f">
             <w10:wrap anchorx="page" anchory="page"/>
           </v:rect>
         </w:pict>
@@ -7247,7 +7193,7 @@
       </w:pPr>
       <w:r>
         <w:pict w14:anchorId="527977B4">
-          <v:shape id="_x0000_s2055" style="position:absolute;margin-left:54.6pt;margin-top:13.35pt;width:355pt;height:4.3pt;z-index:-15698944;visibility:visible;mso-wrap-distance-left:0;mso-wrap-distance-right:0;mso-position-horizontal-relative:page" coordorigin="1092,267" coordsize="7100,86" path="m8192,267r-3545,l1092,267r,86l4647,353r3545,l8192,267xe" fillcolor="#0e6ec5" stroked="f">
+          <v:shape id="_x0000_s1031" style="position:absolute;margin-left:54.6pt;margin-top:13.35pt;width:355pt;height:4.3pt;z-index:-15698944;visibility:visible;mso-wrap-distance-left:0;mso-wrap-distance-right:0;mso-position-horizontal-relative:page" coordorigin="1092,267" coordsize="7100,86" path="m8192,267r-3545,l1092,267r,86l4647,353r3545,l8192,267xe" fillcolor="#0e6ec5" stroked="f">
             <v:path arrowok="t"/>
             <w10:wrap type="topAndBottom" anchorx="page"/>
           </v:shape>
@@ -7264,7 +7210,7 @@
       <w:r>
         <w:lastRenderedPageBreak/>
         <w:pict w14:anchorId="18F20757">
-          <v:rect id="_x0000_s2054" style="position:absolute;margin-left:414.95pt;margin-top:95.45pt;width:196.7pt;height:600.65pt;z-index:-16012800;mso-position-horizontal-relative:page;mso-position-vertical-relative:page" fillcolor="#f1f1f1" stroked="f">
+          <v:rect id="_x0000_s1030" style="position:absolute;margin-left:414.95pt;margin-top:95.45pt;width:196.7pt;height:600.65pt;z-index:-16012800;mso-position-horizontal-relative:page;mso-position-vertical-relative:page" fillcolor="#f1f1f1" stroked="f">
             <w10:wrap anchorx="page" anchory="page"/>
           </v:rect>
         </w:pict>
@@ -7274,11 +7220,11 @@
           <w:sz w:val="22"/>
         </w:rPr>
         <w:pict w14:anchorId="18104B02">
-          <v:group id="_x0000_s2051" style="position:absolute;margin-left:362.45pt;margin-top:-3.4pt;width:88.75pt;height:61.95pt;z-index:-16012288;mso-position-horizontal-relative:page" coordorigin="7249,-68" coordsize="1775,1239">
-            <v:shape id="_x0000_s2053" type="#_x0000_t75" style="position:absolute;left:7256;top:-61;width:1760;height:1224">
+          <v:group id="_x0000_s1027" style="position:absolute;margin-left:362.45pt;margin-top:-3.4pt;width:88.75pt;height:61.95pt;z-index:-16012288;mso-position-horizontal-relative:page" coordorigin="7249,-68" coordsize="1775,1239">
+            <v:shape id="_x0000_s1029" type="#_x0000_t75" style="position:absolute;left:7256;top:-61;width:1760;height:1224">
               <v:imagedata r:id="rId7" o:title=""/>
             </v:shape>
-            <v:rect id="_x0000_s2052" style="position:absolute;left:7256;top:-61;width:1760;height:1224" filled="f" strokecolor="white" strokeweight=".26772mm"/>
+            <v:rect id="_x0000_s1028" style="position:absolute;left:7256;top:-61;width:1760;height:1224" filled="f" strokecolor="white" strokeweight=".26772mm"/>
             <w10:wrap anchorx="page"/>
           </v:group>
         </w:pict>
@@ -7376,8 +7322,8 @@
           <v:stroke joinstyle="miter"/>
           <v:path gradientshapeok="t" o:connecttype="rect"/>
         </v:shapetype>
-        <v:shape id="_x0000_s1025" type="#_x0000_t202" style="position:absolute;margin-left:53.6pt;margin-top:660.85pt;width:296.15pt;height:8.85pt;z-index:-251658752;mso-position-horizontal-relative:page;mso-position-vertical-relative:page" filled="f" stroked="f">
-          <v:textbox style="mso-next-textbox:#_x0000_s1025" inset="0,0,0,0">
+        <v:shape id="_x0000_s2049" type="#_x0000_t202" style="position:absolute;margin-left:53.6pt;margin-top:660.85pt;width:296.15pt;height:8.85pt;z-index:-251658752;mso-position-horizontal-relative:page;mso-position-vertical-relative:page" filled="f" stroked="f">
+          <v:textbox style="mso-next-textbox:#_x0000_s2049" inset="0,0,0,0">
             <w:txbxContent>
               <w:p>
                 <w:pPr>
@@ -8007,6 +7953,50 @@
       <w:rFonts w:ascii="Calibri" w:eastAsia="Calibri" w:hAnsi="Calibri" w:cs="Calibri"/>
     </w:rPr>
   </w:style>
+  <w:style w:type="paragraph" w:styleId="Heading2">
+    <w:name w:val="heading 2"/>
+    <w:basedOn w:val="Normal"/>
+    <w:next w:val="Normal"/>
+    <w:link w:val="Heading2Char"/>
+    <w:uiPriority w:val="9"/>
+    <w:unhideWhenUsed/>
+    <w:qFormat/>
+    <w:rsid w:val="00F2118D"/>
+    <w:pPr>
+      <w:keepNext/>
+      <w:keepLines/>
+      <w:spacing w:before="40"/>
+      <w:outlineLvl w:val="1"/>
+    </w:pPr>
+    <w:rPr>
+      <w:rFonts w:asciiTheme="majorHAnsi" w:eastAsiaTheme="majorEastAsia" w:hAnsiTheme="majorHAnsi" w:cstheme="majorBidi"/>
+      <w:color w:val="365F91" w:themeColor="accent1" w:themeShade="BF"/>
+      <w:sz w:val="26"/>
+      <w:szCs w:val="26"/>
+    </w:rPr>
+  </w:style>
+  <w:style w:type="paragraph" w:styleId="Heading3">
+    <w:name w:val="heading 3"/>
+    <w:basedOn w:val="Normal"/>
+    <w:next w:val="Normal"/>
+    <w:link w:val="Heading3Char"/>
+    <w:uiPriority w:val="9"/>
+    <w:unhideWhenUsed/>
+    <w:qFormat/>
+    <w:rsid w:val="00F2118D"/>
+    <w:pPr>
+      <w:keepNext/>
+      <w:keepLines/>
+      <w:spacing w:before="40"/>
+      <w:outlineLvl w:val="2"/>
+    </w:pPr>
+    <w:rPr>
+      <w:rFonts w:asciiTheme="majorHAnsi" w:eastAsiaTheme="majorEastAsia" w:hAnsiTheme="majorHAnsi" w:cstheme="majorBidi"/>
+      <w:color w:val="243F60" w:themeColor="accent1" w:themeShade="7F"/>
+      <w:sz w:val="24"/>
+      <w:szCs w:val="24"/>
+    </w:rPr>
+  </w:style>
   <w:style w:type="character" w:default="1" w:styleId="DefaultParagraphFont">
     <w:name w:val="Default Paragraph Font"/>
     <w:uiPriority w:val="1"/>
@@ -8143,6 +8133,32 @@
       <w:bCs/>
       <w:sz w:val="20"/>
       <w:szCs w:val="20"/>
+    </w:rPr>
+  </w:style>
+  <w:style w:type="character" w:customStyle="1" w:styleId="Heading2Char">
+    <w:name w:val="Heading 2 Char"/>
+    <w:basedOn w:val="DefaultParagraphFont"/>
+    <w:link w:val="Heading2"/>
+    <w:uiPriority w:val="9"/>
+    <w:rsid w:val="00F2118D"/>
+    <w:rPr>
+      <w:rFonts w:asciiTheme="majorHAnsi" w:eastAsiaTheme="majorEastAsia" w:hAnsiTheme="majorHAnsi" w:cstheme="majorBidi"/>
+      <w:color w:val="365F91" w:themeColor="accent1" w:themeShade="BF"/>
+      <w:sz w:val="26"/>
+      <w:szCs w:val="26"/>
+    </w:rPr>
+  </w:style>
+  <w:style w:type="character" w:customStyle="1" w:styleId="Heading3Char">
+    <w:name w:val="Heading 3 Char"/>
+    <w:basedOn w:val="DefaultParagraphFont"/>
+    <w:link w:val="Heading3"/>
+    <w:uiPriority w:val="9"/>
+    <w:rsid w:val="00F2118D"/>
+    <w:rPr>
+      <w:rFonts w:asciiTheme="majorHAnsi" w:eastAsiaTheme="majorEastAsia" w:hAnsiTheme="majorHAnsi" w:cstheme="majorBidi"/>
+      <w:color w:val="243F60" w:themeColor="accent1" w:themeShade="7F"/>
+      <w:sz w:val="24"/>
+      <w:szCs w:val="24"/>
     </w:rPr>
   </w:style>
 </w:styles>

</xml_diff>